<commit_message>
Rebuild Word doc with latest audit fixes
Updated Quick Answer box, replaced AI wording, swapped redundant FAQs
with 6 unique ones, all clickable hyperlinks preserved.

Co-Authored-By: Claude Opus 4.6 <noreply@anthropic.com>
Claude-Session: https://claude.ai/code/session_012jX8bmSNRmEaK3kdhxwfZr
</commit_message>
<xml_diff>
--- a/blog-content/Best-AI-Blog-Writing-Tools.docx
+++ b/blog-content/Best-AI-Blog-Writing-Tools.docx
@@ -54,7 +54,7 @@
           <w:sz w:val="22"/>
           <w:szCs w:val="22"/>
         </w:rPr>
-        <w:t xml:space="preserve">ChatGPT and Claude are the best free AI blog writing tools for most bloggers. For SEO-focused writing, Koala AI ($9/mo) delivers the most value per dollar. Jasper ($49/mo) only makes sense for marketing teams that need brand voice control across channels. Most solo bloggers need just two or three tools — not an expensive all-in-one platform. I've tested 13 tools across 30+ real blog posts to build this guide.</w:t>
+        <w:t xml:space="preserve">The best free AI blog writing tools are ChatGPT, Claude, and Google Gemini. The best paid options are Koala AI ($9/mo) for SEO blog posts, Frase ($49/mo) for SERP-driven content research, and Jasper ($49/mo) for marketing teams needing brand voice control. Most solo bloggers get full coverage spending $29-39/month on two or three tools combined.</w:t>
       </w:r>
     </w:p>
     <w:p>
@@ -74,7 +74,7 @@
         </w:rPr>
         <w:t xml:space="preserve">The AI writing tools market crossed $2.5 billion in 2026, and 97% of content marketers plan to use AI in their workflow this year, according to </w:t>
       </w:r>
-      <w:hyperlink w:history="1" r:id="rIdhndnghtgdlbmmrz-qnlpe">
+      <w:hyperlink w:history="1" r:id="rIdvrnpox_mdmty89ere2wsr">
         <w:r>
           <w:rPr>
             <w:rStyle w:val="Hyperlink"/>
@@ -116,7 +116,7 @@
           <w:sz w:val="22"/>
           <w:szCs w:val="22"/>
         </w:rPr>
-        <w:t xml:space="preserve">But the tool landscape is a mess. Thirty-plus platforms all claim to be "the best AI writing tool for bloggers." Half of them are wrappers around the same GPT-4 API with different branding. Some charge $79/month for features you can get free from ChatGPT with the right prompt. I've spent the past year testing paid subscriptions, free tiers, and every "lifetime deal" that crossed my feed — and cancelled more tools than I've kept.</w:t>
+        <w:t xml:space="preserve">But the market is a mess. Thirty-plus platforms all claim to be "the best AI writing tool for bloggers." Half of them are wrappers around the same GPT-4 API with different branding. Some charge $79/month for features you can get free from ChatGPT with the right prompt. I've spent the past year testing paid subscriptions, free tiers, and every "lifetime deal" that crossed my feed — and cancelled more tools than I've kept.</w:t>
       </w:r>
     </w:p>
     <w:p>
@@ -154,7 +154,7 @@
         </w:rPr>
         <w:t xml:space="preserve">If you're just starting out and want to learn the full process first, read our guide on </w:t>
       </w:r>
-      <w:hyperlink w:history="1" r:id="rIdslp-8jcmadjpg7cuaph4c">
+      <w:hyperlink w:history="1" r:id="rIdawlhuiyclaybxs0az2rhs">
         <w:r>
           <w:rPr>
             <w:rStyle w:val="Hyperlink"/>
@@ -267,7 +267,7 @@
           <w:sz w:val="22"/>
           <w:szCs w:val="22"/>
         </w:rPr>
-        <w:t xml:space="preserve">Here's what actually matters when picking a tool:</w:t>
+        <w:t xml:space="preserve">Five things actually matter when picking a tool:</w:t>
       </w:r>
     </w:p>
     <w:p>
@@ -648,7 +648,7 @@
         </w:rPr>
         <w:t xml:space="preserve">ChatGPT is the most trusted AI tool among content marketers — 80% rank it as their top pick for reliability, according to </w:t>
       </w:r>
-      <w:hyperlink w:history="1" r:id="rIdrvwvqh7tuwan23d3xmndy">
+      <w:hyperlink w:history="1" r:id="rId3ntz1xdcuqezzaubtocaf">
         <w:r>
           <w:rPr>
             <w:rStyle w:val="Hyperlink"/>
@@ -672,7 +672,7 @@
           <w:sz w:val="22"/>
           <w:szCs w:val="22"/>
         </w:rPr>
-        <w:t xml:space="preserve">. It processes 2.5 billion daily prompts and recently crossed 1 billion monthly active users. Those numbers exist because the tool genuinely works for most writing tasks — I've used it on at least 200 blog drafts myself.</w:t>
+        <w:t xml:space="preserve">. It processes 2.5 billion daily prompts and recently crossed 1 billion monthly active users. Those numbers exist because the tool flat-out works for most writing tasks — I've used it on at least 200 blog drafts myself.</w:t>
       </w:r>
     </w:p>
     <w:p>
@@ -1044,7 +1044,7 @@
           <w:sz w:val="22"/>
           <w:szCs w:val="22"/>
         </w:rPr>
-        <w:t xml:space="preserve">The Deep Research feature is genuinely useful — it pulls together information from multiple sources and presents it with citations, similar to Perplexity but with deeper Google Search integration.</w:t>
+        <w:t xml:space="preserve">The Deep Research feature is worth trying — it pulls together information from multiple sources and presents it with citations, similar to Perplexity but with deeper Google Search integration.</w:t>
       </w:r>
     </w:p>
     <w:p>
@@ -1380,7 +1380,7 @@
           <w:sz w:val="22"/>
           <w:szCs w:val="22"/>
         </w:rPr>
-        <w:t xml:space="preserve">Rytr has the most generous genuinely-free tier among dedicated writing platforms — 10,000 characters monthly with no credit card required. For bloggers publishing one or two short posts a month, it covers the basics. Over 8 million users have signed up, largely because the entry barrier is zero.</w:t>
+        <w:t xml:space="preserve">Rytr has the most generous no-strings-attached free tier among dedicated writing platforms — 10,000 characters monthly with no credit card required. For bloggers publishing one or two short posts a month, it covers the basics. Over 8 million users have signed up, largely because the entry barrier is zero.</w:t>
       </w:r>
     </w:p>
     <w:p>
@@ -1727,7 +1727,7 @@
         </w:rPr>
         <w:t xml:space="preserve">For solo bloggers? It's hard to justify $49/month when ChatGPT Plus costs $20 and produces comparable writing quality. </w:t>
       </w:r>
-      <w:hyperlink w:history="1" r:id="rIdvoopar7e0-qpniwu_d8xl">
+      <w:hyperlink w:history="1" r:id="rIdoxk2vq4ireyhxgfrjnvl2">
         <w:r>
           <w:rPr>
             <w:rStyle w:val="Hyperlink"/>
@@ -2025,25 +2025,25 @@
           <w:sz w:val="22"/>
           <w:szCs w:val="22"/>
         </w:rPr>
-        <w:t xml:space="preserve">Frase doesn't try to be a writer — it's a research and optimization platform that happens to include an AI draft feature. In about 30 seconds, it scrapes the top 20 ranking pages for your keyword, identifies which topics they cover, finds the gaps, and builds a content brief you can write from or hand to the AI. In May 2026, Frase added an AI Agent with 80+ skills that automates entire content briefs from a single keyword — a genuine time-saver if you produce briefs regularly.</w:t>
-      </w:r>
-    </w:p>
-    <w:p>
-      <w:pPr>
-        <w:spacing w:after="200"/>
-      </w:pPr>
-      <w:r>
-        <w:rPr>
-          <w:rFonts w:ascii="Calibri" w:cs="Calibri" w:eastAsia="Calibri" w:hAnsi="Calibri"/>
-          <w:b w:val="false"/>
-          <w:bCs w:val="false"/>
-          <w:i w:val="false"/>
-          <w:iCs w:val="false"/>
-          <w:color w:val="333333"/>
-          <w:sz w:val="22"/>
-          <w:szCs w:val="22"/>
-        </w:rPr>
-        <w:t xml:space="preserve">This matters because most AI writing tools ignore competitive analysis. They write in a vacuum. Frase writes based on what's actually working on page one of Google right now.</w:t>
+        <w:t xml:space="preserve">Frase doesn't try to be a writer — it's a research and optimization platform that happens to include an AI draft feature. In about 30 seconds, it scrapes the top 20 ranking pages for your keyword, identifies which topics they cover, finds the gaps, and builds a content brief you can write from or hand to the AI. In May 2026, Frase added an AI Agent with 80+ skills that automates entire content briefs from a single keyword — a real time-saver if you produce briefs regularly.</w:t>
+      </w:r>
+    </w:p>
+    <w:p>
+      <w:pPr>
+        <w:spacing w:after="200"/>
+      </w:pPr>
+      <w:r>
+        <w:rPr>
+          <w:rFonts w:ascii="Calibri" w:cs="Calibri" w:eastAsia="Calibri" w:hAnsi="Calibri"/>
+          <w:b w:val="false"/>
+          <w:bCs w:val="false"/>
+          <w:i w:val="false"/>
+          <w:iCs w:val="false"/>
+          <w:color w:val="333333"/>
+          <w:sz w:val="22"/>
+          <w:szCs w:val="22"/>
+        </w:rPr>
+        <w:t xml:space="preserve">Why does that matter? Most AI writing tools ignore competitive analysis. They write in a vacuum. Frase writes based on what's actually working on page one of Google right now.</w:t>
       </w:r>
     </w:p>
     <w:p>
@@ -2074,7 +2074,7 @@
           <w:sz w:val="22"/>
           <w:szCs w:val="22"/>
         </w:rPr>
-        <w:t xml:space="preserve">Frase's pricing jumped significantly — the old Solo plan at $15/mo is gone, replaced by Starter at $49/mo. That's a 3x increase that prices out many solo bloggers. The Starter plan covers 1 user and 1 domain. If you're publishing 8-10 posts a month, the query limits feel tight. The AI writing quality is decent but not as polished as Claude or ChatGPT — use Frase for research and briefs, then draft elsewhere.</w:t>
+        <w:t xml:space="preserve">Frase's pricing jumped hard — the old Solo plan at $15/mo is gone, replaced by Starter at $49/mo. That's a 3x increase that prices out many solo bloggers. The Starter plan covers 1 user and 1 domain. If you're publishing 8-10 posts a month, the query limits feel tight. The AI writing quality is decent but not as polished as Claude or ChatGPT — use Frase for research and briefs, then draft elsewhere.</w:t>
       </w:r>
     </w:p>
     <w:p>
@@ -2189,7 +2189,7 @@
           <w:sz w:val="22"/>
           <w:szCs w:val="22"/>
         </w:rPr>
-        <w:t xml:space="preserve">Surfer AI (the auto-writing feature) produces full articles optimized against SERP data. The output quality improved significantly in 2026, but it still works better as an optimization layer on top of your own writing than as a standalone writer.</w:t>
+        <w:t xml:space="preserve">Surfer AI (the auto-writing feature) produces full articles optimized against SERP data. The output quality got noticeably better in 2026, but it still works better as an optimization layer on top of your own writing than as a standalone writer.</w:t>
       </w:r>
     </w:p>
     <w:p>
@@ -2565,7 +2565,7 @@
           <w:sz w:val="22"/>
           <w:szCs w:val="22"/>
         </w:rPr>
-        <w:t xml:space="preserve">Here's how to decide based on where you are:</w:t>
+        <w:t xml:space="preserve">Pick your tier based on where you are right now:</w:t>
       </w:r>
     </w:p>
     <w:p>
@@ -2602,7 +2602,7 @@
         </w:rPr>
         <w:t xml:space="preserve">Start free. Use ChatGPT for brainstorming and drafting, Perplexity for research, and Hemingway Editor for readability checks. Total cost: $0. This combination covers every step in the </w:t>
       </w:r>
-      <w:hyperlink w:history="1" r:id="rIdn6r8oat-eiimzhe4zlh4r">
+      <w:hyperlink w:history="1" r:id="rId--vjt1rfkxtc7kzojx1ef">
         <w:r>
           <w:rPr>
             <w:rStyle w:val="Hyperlink"/>
@@ -2803,7 +2803,7 @@
           <w:sz w:val="22"/>
           <w:szCs w:val="22"/>
         </w:rPr>
-        <w:t xml:space="preserve">Here's the workflow that works for most bloggers:</w:t>
+        <w:t xml:space="preserve">This five-stage chain works for most bloggers:</w:t>
       </w:r>
     </w:p>
     <w:p>
@@ -2929,7 +2929,7 @@
         </w:rPr>
         <w:t xml:space="preserve">Edit manually using the </w:t>
       </w:r>
-      <w:hyperlink w:history="1" r:id="rIdwyt5a8clyja18d0_oxndo">
+      <w:hyperlink w:history="1" r:id="rId9zcl6f1ey8iuuqxmvkuz8">
         <w:r>
           <w:rPr>
             <w:rStyle w:val="Hyperlink"/>
@@ -3055,7 +3055,7 @@
           <w:sz w:val="22"/>
           <w:szCs w:val="22"/>
         </w:rPr>
-        <w:t xml:space="preserve">Here's what "built-in SEO" actually means across these tools:</w:t>
+        <w:t xml:space="preserve">This table shows what "built-in SEO" actually means across these tools:</w:t>
       </w:r>
     </w:p>
     <w:tbl>
@@ -4024,7 +4024,7 @@
         </w:rPr>
         <w:t xml:space="preserve">The data backs this up. </w:t>
       </w:r>
-      <w:hyperlink w:history="1" r:id="rIdagfmvwbukjow8px5sfvai">
+      <w:hyperlink w:history="1" r:id="rIdrtutc51ymb8rxwotesiwt">
         <w:r>
           <w:rPr>
             <w:rStyle w:val="Hyperlink"/>
@@ -4066,7 +4066,7 @@
           <w:sz w:val="22"/>
           <w:szCs w:val="22"/>
         </w:rPr>
-        <w:t xml:space="preserve">Here's what AI handles well:</w:t>
+        <w:t xml:space="preserve">What AI handles well right now:</w:t>
       </w:r>
     </w:p>
     <w:p>
@@ -4199,7 +4199,7 @@
           <w:sz w:val="22"/>
           <w:szCs w:val="22"/>
         </w:rPr>
-        <w:t xml:space="preserve">Here's what it still can't do:</w:t>
+        <w:t xml:space="preserve">What it still can't do:</w:t>
       </w:r>
     </w:p>
     <w:p>
@@ -4334,7 +4334,7 @@
         </w:rPr>
         <w:t xml:space="preserve">The bloggers getting results in 2026 aren't choosing between AI and human writing. They're using AI to handle the 80% that's mechanical — structure, research synthesis, first drafts — and spending their time on the 20% that only a human can add: experience, voice, and accuracy. A </w:t>
       </w:r>
-      <w:hyperlink w:history="1" r:id="rIdldplc-tlxejs4sgdntpgy">
+      <w:hyperlink w:history="1" r:id="rIdeamuw0mmiv9hgvfnsfphv">
         <w:r>
           <w:rPr>
             <w:rStyle w:val="Hyperlink"/>
@@ -4781,7 +4781,7 @@
           <w:sz w:val="22"/>
           <w:szCs w:val="22"/>
         </w:rPr>
-        <w:t xml:space="preserve">For GEO and AEO, the tool landscape is still catching up. Research shows that adding statistics (+25.9% visibility boost), citing sources (+24.9%), and including direct quotes (+27.8%) are the strongest tactics for getting cited by AI search engines. These are manual techniques, not automated features.</w:t>
+        <w:t xml:space="preserve">For GEO and AEO, the tools haven't caught up yet. Research shows that adding statistics (+25.9% visibility boost), citing sources (+24.9%), and including direct quotes (+27.8%) are the strongest tactics for getting cited by AI search engines. These are manual techniques, not automated features.</w:t>
       </w:r>
     </w:p>
     <w:p>
@@ -4819,7 +4819,7 @@
         </w:rPr>
         <w:t xml:space="preserve">The practical approach I use: traditional SEO tools for keyword and SERP optimization, then manually apply </w:t>
       </w:r>
-      <w:hyperlink w:history="1" r:id="rIdz1tzm_hb4rjq6kzibe6l4">
+      <w:hyperlink w:history="1" r:id="rIdhl8mole0hj9dy64pwuhh0">
         <w:r>
           <w:rPr>
             <w:rStyle w:val="Hyperlink"/>
@@ -4877,25 +4877,25 @@
           <w:sz w:val="24"/>
           <w:szCs w:val="24"/>
         </w:rPr>
-        <w:t xml:space="preserve">How much do AI blog writing tools cost per month?</w:t>
-      </w:r>
-    </w:p>
-    <w:p>
-      <w:pPr>
-        <w:spacing w:after="200"/>
-      </w:pPr>
-      <w:r>
-        <w:rPr>
-          <w:rFonts w:ascii="Calibri" w:cs="Calibri" w:eastAsia="Calibri" w:hAnsi="Calibri"/>
-          <w:b w:val="false"/>
-          <w:bCs w:val="false"/>
-          <w:i w:val="false"/>
-          <w:iCs w:val="false"/>
-          <w:color w:val="333333"/>
-          <w:sz w:val="22"/>
-          <w:szCs w:val="22"/>
-        </w:rPr>
-        <w:t xml:space="preserve">Free tools (ChatGPT, Claude, Gemini) cover most writing needs. Paid tools range from $9/month (Koala Essentials, Rytr) to $399/month (Writesonic Growth). Most solo bloggers spend $20-39/month total — a paid LLM subscription plus one SEO tool. Teams typically spend $100-200/month across two or three platforms. Pricing has increased across the board in 2026 — Frase tripled from $15 to $49, Writesonic jumped to $79 entry — so check current prices before committing to annual plans.</w:t>
+        <w:t xml:space="preserve">Can I use AI writing tools for languages other than English?</w:t>
+      </w:r>
+    </w:p>
+    <w:p>
+      <w:pPr>
+        <w:spacing w:after="200"/>
+      </w:pPr>
+      <w:r>
+        <w:rPr>
+          <w:rFonts w:ascii="Calibri" w:cs="Calibri" w:eastAsia="Calibri" w:hAnsi="Calibri"/>
+          <w:b w:val="false"/>
+          <w:bCs w:val="false"/>
+          <w:i w:val="false"/>
+          <w:iCs w:val="false"/>
+          <w:color w:val="333333"/>
+          <w:sz w:val="22"/>
+          <w:szCs w:val="22"/>
+        </w:rPr>
+        <w:t xml:space="preserve">ChatGPT and Claude support 50+ languages with solid output quality. Jasper supports 30+ with brand voice consistency. Most specialized SEO tools (Koala, Frase, Surfer) are built for English and offer limited multilingual support. If you blog in Urdu, Arabic, Hindi, or another non-Latin language, ChatGPT and Claude are your strongest options — dedicated platforms haven't caught up yet.</w:t>
       </w:r>
     </w:p>
     <w:p>
@@ -4912,25 +4912,25 @@
           <w:sz w:val="24"/>
           <w:szCs w:val="24"/>
         </w:rPr>
-        <w:t xml:space="preserve">Do AI writing tools produce SEO-optimized content automatically?</w:t>
-      </w:r>
-    </w:p>
-    <w:p>
-      <w:pPr>
-        <w:spacing w:after="200"/>
-      </w:pPr>
-      <w:r>
-        <w:rPr>
-          <w:rFonts w:ascii="Calibri" w:cs="Calibri" w:eastAsia="Calibri" w:hAnsi="Calibri"/>
-          <w:b w:val="false"/>
-          <w:bCs w:val="false"/>
-          <w:i w:val="false"/>
-          <w:iCs w:val="false"/>
-          <w:color w:val="333333"/>
-          <w:sz w:val="22"/>
-          <w:szCs w:val="22"/>
-        </w:rPr>
-        <w:t xml:space="preserve">Only dedicated SEO tools (Koala, Frase, Surfer, SEOWriting AI) include real keyword data and content scoring. ChatGPT, Claude, and Gemini write well but have zero built-in SEO features. For proper SEO optimization, pair a writing tool with a dedicated SEO platform.</w:t>
+        <w:t xml:space="preserve">How often do AI writing tools update their underlying models?</w:t>
+      </w:r>
+    </w:p>
+    <w:p>
+      <w:pPr>
+        <w:spacing w:after="200"/>
+      </w:pPr>
+      <w:r>
+        <w:rPr>
+          <w:rFonts w:ascii="Calibri" w:cs="Calibri" w:eastAsia="Calibri" w:hAnsi="Calibri"/>
+          <w:b w:val="false"/>
+          <w:bCs w:val="false"/>
+          <w:i w:val="false"/>
+          <w:iCs w:val="false"/>
+          <w:color w:val="333333"/>
+          <w:sz w:val="22"/>
+          <w:szCs w:val="22"/>
+        </w:rPr>
+        <w:t xml:space="preserve">ChatGPT and Claude push major model upgrades 2-3 times per year. Jasper, Writesonic, and Koala run on OpenAI's or Anthropic's API, so they upgrade when the underlying provider does. Check each tool's changelog before renewing annual plans — a tool that was best six months ago may have fallen behind after a competitor's model upgrade.</w:t>
       </w:r>
     </w:p>
     <w:p>
@@ -4947,25 +4947,25 @@
           <w:sz w:val="24"/>
           <w:szCs w:val="24"/>
         </w:rPr>
-        <w:t xml:space="preserve">Can I use AI writing tools for languages other than English?</w:t>
-      </w:r>
-    </w:p>
-    <w:p>
-      <w:pPr>
-        <w:spacing w:after="200"/>
-      </w:pPr>
-      <w:r>
-        <w:rPr>
-          <w:rFonts w:ascii="Calibri" w:cs="Calibri" w:eastAsia="Calibri" w:hAnsi="Calibri"/>
-          <w:b w:val="false"/>
-          <w:bCs w:val="false"/>
-          <w:i w:val="false"/>
-          <w:iCs w:val="false"/>
-          <w:color w:val="333333"/>
-          <w:sz w:val="22"/>
-          <w:szCs w:val="22"/>
-        </w:rPr>
-        <w:t xml:space="preserve">ChatGPT and Claude support 50+ languages. Jasper supports 30+ with brand voice. Most specialized tools (Koala, Frase, Surfer) are primarily English-focused, with limited multilingual support. If you blog in Urdu, Arabic, or another non-Latin language, ChatGPT and Claude are your best options — dedicated platforms haven't caught up yet.</w:t>
+        <w:t xml:space="preserve">What happens to my content when I paste it into an AI writing tool?</w:t>
+      </w:r>
+    </w:p>
+    <w:p>
+      <w:pPr>
+        <w:spacing w:after="200"/>
+      </w:pPr>
+      <w:r>
+        <w:rPr>
+          <w:rFonts w:ascii="Calibri" w:cs="Calibri" w:eastAsia="Calibri" w:hAnsi="Calibri"/>
+          <w:b w:val="false"/>
+          <w:bCs w:val="false"/>
+          <w:i w:val="false"/>
+          <w:iCs w:val="false"/>
+          <w:color w:val="333333"/>
+          <w:sz w:val="22"/>
+          <w:szCs w:val="22"/>
+        </w:rPr>
+        <w:t xml:space="preserve">It depends on the tool and your plan. OpenAI uses free-tier ChatGPT conversations for model training unless you opt out in settings. Paid plans (ChatGPT Plus, Claude Pro) don't train on your inputs by default. Jasper and Copy.ai state they don't use customer content for training. Always read the data policy before pasting client work, proprietary research, or unpublished content into any AI tool — once it's in a training dataset, you can't pull it back.</w:t>
       </w:r>
     </w:p>
     <w:p>
@@ -4982,25 +4982,25 @@
           <w:sz w:val="24"/>
           <w:szCs w:val="24"/>
         </w:rPr>
-        <w:t xml:space="preserve">Is it safe to publish AI-generated content on WordPress?</w:t>
-      </w:r>
-    </w:p>
-    <w:p>
-      <w:pPr>
-        <w:spacing w:after="200"/>
-      </w:pPr>
-      <w:r>
-        <w:rPr>
-          <w:rFonts w:ascii="Calibri" w:cs="Calibri" w:eastAsia="Calibri" w:hAnsi="Calibri"/>
-          <w:b w:val="false"/>
-          <w:bCs w:val="false"/>
-          <w:i w:val="false"/>
-          <w:iCs w:val="false"/>
-          <w:color w:val="333333"/>
-          <w:sz w:val="22"/>
-          <w:szCs w:val="22"/>
-        </w:rPr>
-        <w:t xml:space="preserve">Yes, with editing. Google doesn't penalize AI content — it penalizes low-quality content regardless of origin. Add personal experience, verify every fact, optimize for SEO, and edit for your voice. WordPress plugins like Yoast and Rank Math help with the technical SEO side. The risk isn't using AI — it's publishing unedited AI drafts.</w:t>
+        <w:t xml:space="preserve">Can AI writing tools help repurpose a blog post into other content formats?</w:t>
+      </w:r>
+    </w:p>
+    <w:p>
+      <w:pPr>
+        <w:spacing w:after="200"/>
+      </w:pPr>
+      <w:r>
+        <w:rPr>
+          <w:rFonts w:ascii="Calibri" w:cs="Calibri" w:eastAsia="Calibri" w:hAnsi="Calibri"/>
+          <w:b w:val="false"/>
+          <w:bCs w:val="false"/>
+          <w:i w:val="false"/>
+          <w:iCs w:val="false"/>
+          <w:color w:val="333333"/>
+          <w:sz w:val="22"/>
+          <w:szCs w:val="22"/>
+        </w:rPr>
+        <w:t xml:space="preserve">Yes — this is where tools like ChatGPT and Claude save the most time after the blog post is live. Paste your finished article and ask for 10 tweet threads, a LinkedIn carousel script, an email newsletter summary, or YouTube video script outline. Copy.ai and Jasper automate this with template chains. One 2,500-word blog post can feed a full week of social content across four platforms in under 30 minutes.</w:t>
       </w:r>
     </w:p>
     <w:p>
@@ -5017,25 +5017,25 @@
           <w:sz w:val="24"/>
           <w:szCs w:val="24"/>
         </w:rPr>
-        <w:t xml:space="preserve">Which AI tool is best for affiliate blog posts specifically?</w:t>
-      </w:r>
-    </w:p>
-    <w:p>
-      <w:pPr>
-        <w:spacing w:after="200"/>
-      </w:pPr>
-      <w:r>
-        <w:rPr>
-          <w:rFonts w:ascii="Calibri" w:cs="Calibri" w:eastAsia="Calibri" w:hAnsi="Calibri"/>
-          <w:b w:val="false"/>
-          <w:bCs w:val="false"/>
-          <w:i w:val="false"/>
-          <w:iCs w:val="false"/>
-          <w:color w:val="333333"/>
-          <w:sz w:val="22"/>
-          <w:szCs w:val="22"/>
-        </w:rPr>
-        <w:t xml:space="preserve">Koala AI ($9/mo) is the only tool with a dedicated product review generator — paste an Amazon ASIN, get a full review article. For comparison posts and buying guides, ChatGPT Plus with detailed prompts produces better structured content. Pair either with Frase or NeuronWriter for keyword optimization.</w:t>
+        <w:t xml:space="preserve">How do I measure whether an AI writing tool is actually improving my blog's results?</w:t>
+      </w:r>
+    </w:p>
+    <w:p>
+      <w:pPr>
+        <w:spacing w:after="200"/>
+      </w:pPr>
+      <w:r>
+        <w:rPr>
+          <w:rFonts w:ascii="Calibri" w:cs="Calibri" w:eastAsia="Calibri" w:hAnsi="Calibri"/>
+          <w:b w:val="false"/>
+          <w:bCs w:val="false"/>
+          <w:i w:val="false"/>
+          <w:iCs w:val="false"/>
+          <w:color w:val="333333"/>
+          <w:sz w:val="22"/>
+          <w:szCs w:val="22"/>
+        </w:rPr>
+        <w:t xml:space="preserve">Track three numbers before and after adopting a tool: time per published post (drafting + editing hours), organic traffic per post after 90 days, and cost per post (tool subscriptions divided by posts published). If time drops but traffic stays flat, the tool is helping efficiency. If traffic rises per post, the tool is helping quality. If cost per post exceeds what you'd pay a freelancer for the same output, the tool isn't worth it.</w:t>
       </w:r>
     </w:p>
     <w:p>
@@ -5052,60 +5052,25 @@
           <w:sz w:val="24"/>
           <w:szCs w:val="24"/>
         </w:rPr>
-        <w:t xml:space="preserve">How often do AI writing tools update their underlying models?</w:t>
-      </w:r>
-    </w:p>
-    <w:p>
-      <w:pPr>
-        <w:spacing w:after="200"/>
-      </w:pPr>
-      <w:r>
-        <w:rPr>
-          <w:rFonts w:ascii="Calibri" w:cs="Calibri" w:eastAsia="Calibri" w:hAnsi="Calibri"/>
-          <w:b w:val="false"/>
-          <w:bCs w:val="false"/>
-          <w:i w:val="false"/>
-          <w:iCs w:val="false"/>
-          <w:color w:val="333333"/>
-          <w:sz w:val="22"/>
-          <w:szCs w:val="22"/>
-        </w:rPr>
-        <w:t xml:space="preserve">ChatGPT and Claude update every few months — major model upgrades happen 2-3 times per year. Jasper, Writesonic, and Koala use OpenAI's or Anthropic's API, so they upgrade when the underlying provider does. Check each tool's changelog before renewing annual plans — a tool that was best six months ago may have been overtaken.</w:t>
-      </w:r>
-    </w:p>
-    <w:p>
-      <w:pPr>
-        <w:pStyle w:val="Heading3"/>
-        <w:spacing w:after="160" w:before="320"/>
-      </w:pPr>
-      <w:r>
-        <w:rPr>
-          <w:rFonts w:ascii="Calibri" w:cs="Calibri" w:eastAsia="Calibri" w:hAnsi="Calibri"/>
-          <w:b/>
-          <w:bCs/>
-          <w:color w:val="7C3AED"/>
-          <w:sz w:val="24"/>
-          <w:szCs w:val="24"/>
-        </w:rPr>
-        <w:t xml:space="preserve">Do any AI writing tools optimize for GEO (Generative Engine Optimization)?</w:t>
-      </w:r>
-    </w:p>
-    <w:p>
-      <w:pPr>
-        <w:spacing w:after="200"/>
-      </w:pPr>
-      <w:r>
-        <w:rPr>
-          <w:rFonts w:ascii="Calibri" w:cs="Calibri" w:eastAsia="Calibri" w:hAnsi="Calibri"/>
-          <w:b w:val="false"/>
-          <w:bCs w:val="false"/>
-          <w:i w:val="false"/>
-          <w:iCs w:val="false"/>
-          <w:color w:val="333333"/>
-          <w:sz w:val="22"/>
-          <w:szCs w:val="22"/>
-        </w:rPr>
-        <w:t xml:space="preserve">No tool fully automates GEO yet. Writesonic tracks your content's visibility in AI search engines (ChatGPT, Perplexity, Google AI Overviews), and Surfer added a GEO scoring feature in 2026. But the actual optimization — adding citation-worthy statistics, structuring direct answers, including entity-rich content — is still manual work. The bloggers winning AI search citations in 2026 are applying these techniques by hand, not waiting for tools to catch up.</w:t>
+        <w:t xml:space="preserve">Are there AI writing tools built specifically for WordPress users?</w:t>
+      </w:r>
+    </w:p>
+    <w:p>
+      <w:pPr>
+        <w:spacing w:after="200"/>
+      </w:pPr>
+      <w:r>
+        <w:rPr>
+          <w:rFonts w:ascii="Calibri" w:cs="Calibri" w:eastAsia="Calibri" w:hAnsi="Calibri"/>
+          <w:b w:val="false"/>
+          <w:bCs w:val="false"/>
+          <w:i w:val="false"/>
+          <w:iCs w:val="false"/>
+          <w:color w:val="333333"/>
+          <w:sz w:val="22"/>
+          <w:szCs w:val="22"/>
+        </w:rPr>
+        <w:t xml:space="preserve">Several tools offer direct WordPress publishing: Koala AI, SEOWriting AI, and GetGenie AI all connect to WordPress and can publish drafts straight to your blog with one click. AIOSEO has a built-in AI assistant that works inside the Gutenberg editor without leaving WordPress at all. If your entire workflow lives in WordPress, these cut out the copy-paste step — but the drafts still need manual editing before going live.</w:t>
       </w:r>
     </w:p>
     <w:p>
@@ -5232,7 +5197,7 @@
         </w:rPr>
         <w:t xml:space="preserve">Ready to put these tools to work? </w:t>
       </w:r>
-      <w:hyperlink w:history="1" r:id="rId9byopyj7gxtc6seoymokw">
+      <w:hyperlink w:history="1" r:id="rId1g-vvxq9bz73ck-0dqtvp">
         <w:r>
           <w:rPr>
             <w:rStyle w:val="Hyperlink"/>

</xml_diff>

<commit_message>
Major rewrite: 10 tools, personal experience, Search Console proof
- Reduced from 13 to 10 tools (removed Rytr, Frase, SEOWriting AI, Copy.ai)
- Added Grok (xAI) for real-time data and image generation
- Promoted NeuronWriter to full section
- Moved Claude to #1 position with detailed personal experience
- Added honest ChatGPT experience (90% instruction miss rate)
- Added Gemini experience (image logos, video inconsistency)
- Added Search Console screenshot placeholders showing growth:
  77 clicks → 164 clicks → 970 clicks, position 12.3 → 9
- Updated all cross-references, SEO table, workflow, FAQs
- Rebuilt Word doc with all changes and clickable hyperlinks

Co-Authored-By: Claude Opus 4.6 <noreply@anthropic.com>
Claude-Session: https://claude.ai/code/session_012jX8bmSNRmEaK3kdhxwfZr
</commit_message>
<xml_diff>
--- a/blog-content/Best-AI-Blog-Writing-Tools.docx
+++ b/blog-content/Best-AI-Blog-Writing-Tools.docx
@@ -16,7 +16,7 @@
           <w:sz w:val="36"/>
           <w:szCs w:val="36"/>
         </w:rPr>
-        <w:t xml:space="preserve">13 Best AI Blog Writing Tools in 2026 (Free &amp; Paid, Tested)</w:t>
+        <w:t xml:space="preserve">10 Best AI Blog Writing Tools in 2026 (Free &amp; Paid, Tested)</w:t>
       </w:r>
     </w:p>
     <w:p>
@@ -54,7 +54,7 @@
           <w:sz w:val="22"/>
           <w:szCs w:val="22"/>
         </w:rPr>
-        <w:t xml:space="preserve">The best free AI blog writing tools are ChatGPT, Claude, and Google Gemini. The best paid options are Koala AI ($9/mo) for SEO blog posts, Frase ($49/mo) for SERP-driven content research, and Jasper ($49/mo) for marketing teams needing brand voice control. Most solo bloggers get full coverage spending $29-39/month on two or three tools combined.</w:t>
+        <w:t xml:space="preserve">The best AI blog writing tool is Claude for drafting — it follows complex instructions more accurately than ChatGPT or Gemini. For SEO blog posts, Koala AI ($9/mo) offers the best value. NeuronWriter ($23/mo) provides NLP content scoring at half Surfer's price. Most solo bloggers get full coverage spending $29-39/month on two or three tools combined.</w:t>
       </w:r>
     </w:p>
     <w:p>
@@ -74,7 +74,7 @@
         </w:rPr>
         <w:t xml:space="preserve">The AI writing tools market crossed $2.5 billion in 2026, and 97% of content marketers plan to use AI in their workflow this year, according to </w:t>
       </w:r>
-      <w:hyperlink w:history="1" r:id="rIdvrnpox_mdmty89ere2wsr">
+      <w:hyperlink w:history="1" r:id="rId5klzciryzsiuxe-2sqygn">
         <w:r>
           <w:rPr>
             <w:rStyle w:val="Hyperlink"/>
@@ -116,25 +116,25 @@
           <w:sz w:val="22"/>
           <w:szCs w:val="22"/>
         </w:rPr>
-        <w:t xml:space="preserve">But the market is a mess. Thirty-plus platforms all claim to be "the best AI writing tool for bloggers." Half of them are wrappers around the same GPT-4 API with different branding. Some charge $79/month for features you can get free from ChatGPT with the right prompt. I've spent the past year testing paid subscriptions, free tiers, and every "lifetime deal" that crossed my feed — and cancelled more tools than I've kept.</w:t>
-      </w:r>
-    </w:p>
-    <w:p>
-      <w:pPr>
-        <w:spacing w:after="200"/>
-      </w:pPr>
-      <w:r>
-        <w:rPr>
-          <w:rFonts w:ascii="Calibri" w:cs="Calibri" w:eastAsia="Calibri" w:hAnsi="Calibri"/>
-          <w:b w:val="false"/>
-          <w:bCs w:val="false"/>
-          <w:i w:val="false"/>
-          <w:iCs w:val="false"/>
-          <w:color w:val="333333"/>
-          <w:sz w:val="22"/>
-          <w:szCs w:val="22"/>
-        </w:rPr>
-        <w:t xml:space="preserve">I tested 13 tools on actual blog posts — not demo content, not marketing copy, real articles meant to rank and bring traffic. This guide breaks down what each tool actually does well, what it doesn't, and which combination fits your budget and workflow. I'll also show you which tools I personally use for this blog.</w:t>
+        <w:t xml:space="preserve">But the market is a mess. Thirty-plus platforms all claim to be "the best AI writing tool for bloggers." Half of them are wrappers around the same GPT-4 API with different branding. Some charge $79/month for features you can get free with the right prompt. I've spent the past year testing paid subscriptions, free tiers, and every "lifetime deal" that crossed my feed — and cancelled more tools than I've kept.</w:t>
+      </w:r>
+    </w:p>
+    <w:p>
+      <w:pPr>
+        <w:spacing w:after="200"/>
+      </w:pPr>
+      <w:r>
+        <w:rPr>
+          <w:rFonts w:ascii="Calibri" w:cs="Calibri" w:eastAsia="Calibri" w:hAnsi="Calibri"/>
+          <w:b w:val="false"/>
+          <w:bCs w:val="false"/>
+          <w:i w:val="false"/>
+          <w:iCs w:val="false"/>
+          <w:color w:val="333333"/>
+          <w:sz w:val="22"/>
+          <w:szCs w:val="22"/>
+        </w:rPr>
+        <w:t xml:space="preserve">I tested 10 tools on actual blog posts — not demo content, not marketing copy, real articles meant to rank and bring traffic. This guide breaks down what each tool actually does well, what it doesn't, and which combination fits your budget and workflow. I'll also show you Google Search Console data proving which tool produces content that actually ranks.</w:t>
       </w:r>
     </w:p>
     <w:p>
@@ -154,7 +154,7 @@
         </w:rPr>
         <w:t xml:space="preserve">If you're just starting out and want to learn the full process first, read our guide on </w:t>
       </w:r>
-      <w:hyperlink w:history="1" r:id="rIdawlhuiyclaybxs0az2rhs">
+      <w:hyperlink w:history="1" r:id="rIdjzc46odxzp1dbfdmm63dh">
         <w:r>
           <w:rPr>
             <w:rStyle w:val="Hyperlink"/>
@@ -326,20 +326,20 @@
           <w:sz w:val="22"/>
           <w:szCs w:val="22"/>
         </w:rPr>
-        <w:t xml:space="preserve">Long-form capability</w:t>
-      </w:r>
-      <w:r>
-        <w:rPr>
-          <w:rFonts w:ascii="Calibri" w:cs="Calibri" w:eastAsia="Calibri" w:hAnsi="Calibri"/>
-          <w:b w:val="false"/>
-          <w:bCs w:val="false"/>
-          <w:i w:val="false"/>
-          <w:iCs w:val="false"/>
-          <w:color w:val="333333"/>
-          <w:sz w:val="22"/>
-          <w:szCs w:val="22"/>
-        </w:rPr>
-        <w:t xml:space="preserve"> — Can it write a coherent 2,000+ word article, or does it lose the thread after 500 words?</w:t>
+        <w:t xml:space="preserve">Instruction accuracy</w:t>
+      </w:r>
+      <w:r>
+        <w:rPr>
+          <w:rFonts w:ascii="Calibri" w:cs="Calibri" w:eastAsia="Calibri" w:hAnsi="Calibri"/>
+          <w:b w:val="false"/>
+          <w:bCs w:val="false"/>
+          <w:i w:val="false"/>
+          <w:iCs w:val="false"/>
+          <w:color w:val="333333"/>
+          <w:sz w:val="22"/>
+          <w:szCs w:val="22"/>
+        </w:rPr>
+        <w:t xml:space="preserve"> — Does it follow your brief exactly, or does it drop internal links, skip citations, and ignore your structure halfway through?</w:t>
       </w:r>
     </w:p>
     <w:p>
@@ -362,20 +362,20 @@
           <w:sz w:val="22"/>
           <w:szCs w:val="22"/>
         </w:rPr>
-        <w:t xml:space="preserve">SEO integration</w:t>
-      </w:r>
-      <w:r>
-        <w:rPr>
-          <w:rFonts w:ascii="Calibri" w:cs="Calibri" w:eastAsia="Calibri" w:hAnsi="Calibri"/>
-          <w:b w:val="false"/>
-          <w:bCs w:val="false"/>
-          <w:i w:val="false"/>
-          <w:iCs w:val="false"/>
-          <w:color w:val="333333"/>
-          <w:sz w:val="22"/>
-          <w:szCs w:val="22"/>
-        </w:rPr>
-        <w:t xml:space="preserve"> — Does it pull real keyword data, or just sprinkle your target keyword into every other sentence?</w:t>
+        <w:t xml:space="preserve">Long-form capability</w:t>
+      </w:r>
+      <w:r>
+        <w:rPr>
+          <w:rFonts w:ascii="Calibri" w:cs="Calibri" w:eastAsia="Calibri" w:hAnsi="Calibri"/>
+          <w:b w:val="false"/>
+          <w:bCs w:val="false"/>
+          <w:i w:val="false"/>
+          <w:iCs w:val="false"/>
+          <w:color w:val="333333"/>
+          <w:sz w:val="22"/>
+          <w:szCs w:val="22"/>
+        </w:rPr>
+        <w:t xml:space="preserve"> — Can it write a coherent 2,000+ word article, or does it lose the thread after 500 words?</w:t>
       </w:r>
     </w:p>
     <w:p>
@@ -398,20 +398,20 @@
           <w:sz w:val="22"/>
           <w:szCs w:val="22"/>
         </w:rPr>
-        <w:t xml:space="preserve">Pricing honesty</w:t>
-      </w:r>
-      <w:r>
-        <w:rPr>
-          <w:rFonts w:ascii="Calibri" w:cs="Calibri" w:eastAsia="Calibri" w:hAnsi="Calibri"/>
-          <w:b w:val="false"/>
-          <w:bCs w:val="false"/>
-          <w:i w:val="false"/>
-          <w:iCs w:val="false"/>
-          <w:color w:val="333333"/>
-          <w:sz w:val="22"/>
-          <w:szCs w:val="22"/>
-        </w:rPr>
-        <w:t xml:space="preserve"> — "Free" means four different things in this market: free forever, free trial, freemium with gutted features, or free drafting with paid publishing</w:t>
+        <w:t xml:space="preserve">SEO integration</w:t>
+      </w:r>
+      <w:r>
+        <w:rPr>
+          <w:rFonts w:ascii="Calibri" w:cs="Calibri" w:eastAsia="Calibri" w:hAnsi="Calibri"/>
+          <w:b w:val="false"/>
+          <w:bCs w:val="false"/>
+          <w:i w:val="false"/>
+          <w:iCs w:val="false"/>
+          <w:color w:val="333333"/>
+          <w:sz w:val="22"/>
+          <w:szCs w:val="22"/>
+        </w:rPr>
+        <w:t xml:space="preserve"> — Does it pull real keyword data, or just sprinkle your target keyword into every other sentence?</w:t>
       </w:r>
     </w:p>
     <w:p>
@@ -434,38 +434,38 @@
           <w:sz w:val="22"/>
           <w:szCs w:val="22"/>
         </w:rPr>
-        <w:t xml:space="preserve">Workflow fit</w:t>
-      </w:r>
-      <w:r>
-        <w:rPr>
-          <w:rFonts w:ascii="Calibri" w:cs="Calibri" w:eastAsia="Calibri" w:hAnsi="Calibri"/>
-          <w:b w:val="false"/>
-          <w:bCs w:val="false"/>
-          <w:i w:val="false"/>
-          <w:iCs w:val="false"/>
-          <w:color w:val="333333"/>
-          <w:sz w:val="22"/>
-          <w:szCs w:val="22"/>
-        </w:rPr>
-        <w:t xml:space="preserve"> — Does it connect to WordPress, Google Docs, or wherever you actually write?</w:t>
-      </w:r>
-    </w:p>
-    <w:p>
-      <w:pPr>
-        <w:spacing w:after="200"/>
-      </w:pPr>
-      <w:r>
-        <w:rPr>
-          <w:rFonts w:ascii="Calibri" w:cs="Calibri" w:eastAsia="Calibri" w:hAnsi="Calibri"/>
-          <w:b w:val="false"/>
-          <w:bCs w:val="false"/>
-          <w:i w:val="false"/>
-          <w:iCs w:val="false"/>
-          <w:color w:val="333333"/>
-          <w:sz w:val="22"/>
-          <w:szCs w:val="22"/>
-        </w:rPr>
-        <w:t xml:space="preserve">I scored every tool below on these five criteria. No affiliate rankings, no "best overall" badges handed to the highest bidder.</w:t>
+        <w:t xml:space="preserve">Pricing honesty</w:t>
+      </w:r>
+      <w:r>
+        <w:rPr>
+          <w:rFonts w:ascii="Calibri" w:cs="Calibri" w:eastAsia="Calibri" w:hAnsi="Calibri"/>
+          <w:b w:val="false"/>
+          <w:bCs w:val="false"/>
+          <w:i w:val="false"/>
+          <w:iCs w:val="false"/>
+          <w:color w:val="333333"/>
+          <w:sz w:val="22"/>
+          <w:szCs w:val="22"/>
+        </w:rPr>
+        <w:t xml:space="preserve"> — "Free" means four different things in this market: free forever, free trial, freemium with gutted features, or free drafting with paid publishing</w:t>
+      </w:r>
+    </w:p>
+    <w:p>
+      <w:pPr>
+        <w:spacing w:after="200"/>
+      </w:pPr>
+      <w:r>
+        <w:rPr>
+          <w:rFonts w:ascii="Calibri" w:cs="Calibri" w:eastAsia="Calibri" w:hAnsi="Calibri"/>
+          <w:b w:val="false"/>
+          <w:bCs w:val="false"/>
+          <w:i w:val="false"/>
+          <w:iCs w:val="false"/>
+          <w:color w:val="333333"/>
+          <w:sz w:val="22"/>
+          <w:szCs w:val="22"/>
+        </w:rPr>
+        <w:t xml:space="preserve">I scored every tool below on these criteria. No affiliate rankings, no "best overall" badges handed to the highest bidder — just what actually works after a year of building a real blog with these tools.</w:t>
       </w:r>
     </w:p>
     <w:p>
@@ -500,7 +500,7 @@
           <w:sz w:val="22"/>
           <w:szCs w:val="22"/>
         </w:rPr>
-        <w:t xml:space="preserve">ChatGPT, Claude, and Google Gemini handle 80% of what solo bloggers need — drafting, brainstorming, outlining, and editing — without spending a rupee. The other free options fill specific gaps.</w:t>
+        <w:t xml:space="preserve">Claude, ChatGPT, and Google Gemini handle 80% of what solo bloggers need — drafting, brainstorming, outlining, and editing — without spending a rupee. Grok and Perplexity fill specific gaps in research and real-time data.</w:t>
       </w:r>
     </w:p>
     <w:p>
@@ -535,6 +535,381 @@
           <w:sz w:val="24"/>
           <w:szCs w:val="24"/>
         </w:rPr>
+        <w:t xml:space="preserve">Claude (Anthropic)</w:t>
+      </w:r>
+    </w:p>
+    <w:p>
+      <w:pPr>
+        <w:spacing w:after="200"/>
+      </w:pPr>
+      <w:r>
+        <w:rPr>
+          <w:rFonts w:ascii="Calibri" w:cs="Calibri" w:eastAsia="Calibri" w:hAnsi="Calibri"/>
+          <w:b/>
+          <w:bCs/>
+          <w:i w:val="false"/>
+          <w:iCs w:val="false"/>
+          <w:color w:val="333333"/>
+          <w:sz w:val="22"/>
+          <w:szCs w:val="22"/>
+        </w:rPr>
+        <w:t xml:space="preserve">Best for: </w:t>
+      </w:r>
+      <w:r>
+        <w:rPr>
+          <w:rFonts w:ascii="Calibri" w:cs="Calibri" w:eastAsia="Calibri" w:hAnsi="Calibri"/>
+          <w:b w:val="false"/>
+          <w:bCs w:val="false"/>
+          <w:i w:val="false"/>
+          <w:iCs w:val="false"/>
+          <w:color w:val="333333"/>
+          <w:sz w:val="22"/>
+          <w:szCs w:val="22"/>
+        </w:rPr>
+        <w:t xml:space="preserve">Long-form blog writing, following complex instructions, detailed guides</w:t>
+      </w:r>
+    </w:p>
+    <w:p>
+      <w:pPr>
+        <w:spacing w:after="200"/>
+      </w:pPr>
+      <w:r>
+        <w:rPr>
+          <w:rFonts w:ascii="Calibri" w:cs="Calibri" w:eastAsia="Calibri" w:hAnsi="Calibri"/>
+          <w:b/>
+          <w:bCs/>
+          <w:i w:val="false"/>
+          <w:iCs w:val="false"/>
+          <w:color w:val="333333"/>
+          <w:sz w:val="22"/>
+          <w:szCs w:val="22"/>
+        </w:rPr>
+        <w:t xml:space="preserve">Free tier: </w:t>
+      </w:r>
+      <w:r>
+        <w:rPr>
+          <w:rFonts w:ascii="Calibri" w:cs="Calibri" w:eastAsia="Calibri" w:hAnsi="Calibri"/>
+          <w:b w:val="false"/>
+          <w:bCs w:val="false"/>
+          <w:i w:val="false"/>
+          <w:iCs w:val="false"/>
+          <w:color w:val="333333"/>
+          <w:sz w:val="22"/>
+          <w:szCs w:val="22"/>
+        </w:rPr>
+        <w:t xml:space="preserve">Daily message limit, 200K token context window</w:t>
+      </w:r>
+    </w:p>
+    <w:p>
+      <w:pPr>
+        <w:spacing w:after="200"/>
+      </w:pPr>
+      <w:r>
+        <w:rPr>
+          <w:rFonts w:ascii="Calibri" w:cs="Calibri" w:eastAsia="Calibri" w:hAnsi="Calibri"/>
+          <w:b/>
+          <w:bCs/>
+          <w:i w:val="false"/>
+          <w:iCs w:val="false"/>
+          <w:color w:val="333333"/>
+          <w:sz w:val="22"/>
+          <w:szCs w:val="22"/>
+        </w:rPr>
+        <w:t xml:space="preserve">Paid: </w:t>
+      </w:r>
+      <w:r>
+        <w:rPr>
+          <w:rFonts w:ascii="Calibri" w:cs="Calibri" w:eastAsia="Calibri" w:hAnsi="Calibri"/>
+          <w:b w:val="false"/>
+          <w:bCs w:val="false"/>
+          <w:i w:val="false"/>
+          <w:iCs w:val="false"/>
+          <w:color w:val="333333"/>
+          <w:sz w:val="22"/>
+          <w:szCs w:val="22"/>
+        </w:rPr>
+        <w:t xml:space="preserve">Pro at $20/mo, Max at $100-200/mo</w:t>
+      </w:r>
+    </w:p>
+    <w:p>
+      <w:pPr>
+        <w:spacing w:after="200"/>
+      </w:pPr>
+      <w:r>
+        <w:rPr>
+          <w:rFonts w:ascii="Calibri" w:cs="Calibri" w:eastAsia="Calibri" w:hAnsi="Calibri"/>
+          <w:b w:val="false"/>
+          <w:bCs w:val="false"/>
+          <w:i w:val="false"/>
+          <w:iCs w:val="false"/>
+          <w:color w:val="333333"/>
+          <w:sz w:val="22"/>
+          <w:szCs w:val="22"/>
+        </w:rPr>
+        <w:t xml:space="preserve">Claude is my #1 pick for blog writing — and it's not close. I've tested every major AI tool on this list over the past year, and Claude is the only one that consistently follows complex multi-step instructions without dropping pieces.</w:t>
+      </w:r>
+    </w:p>
+    <w:p>
+      <w:pPr>
+        <w:spacing w:after="200"/>
+      </w:pPr>
+      <w:r>
+        <w:rPr>
+          <w:rFonts w:ascii="Calibri" w:cs="Calibri" w:eastAsia="Calibri" w:hAnsi="Calibri"/>
+          <w:b w:val="false"/>
+          <w:bCs w:val="false"/>
+          <w:i w:val="false"/>
+          <w:iCs w:val="false"/>
+          <w:color w:val="333333"/>
+          <w:sz w:val="22"/>
+          <w:szCs w:val="22"/>
+        </w:rPr>
+        <w:t xml:space="preserve">When I give a writing tool a detailed brief — target keywords, internal links to include, external citations to add, specific structure, tone requirements — most tools miss something. Claude doesn't. Same instructions, same brief — the output comes back with every internal link placed, every citation included, every structural requirement met. Not only does it follow each instruction, it adds relevant details I didn't ask for that improve the article. Whether I'm continuing in the same conversation or starting fresh within a project, the quality stays consistent.</w:t>
+      </w:r>
+    </w:p>
+    <w:p>
+      <w:pPr>
+        <w:spacing w:after="200"/>
+      </w:pPr>
+      <w:r>
+        <w:rPr>
+          <w:rFonts w:ascii="Calibri" w:cs="Calibri" w:eastAsia="Calibri" w:hAnsi="Calibri"/>
+          <w:b w:val="false"/>
+          <w:bCs w:val="false"/>
+          <w:i w:val="false"/>
+          <w:iCs w:val="false"/>
+          <w:color w:val="333333"/>
+          <w:sz w:val="22"/>
+          <w:szCs w:val="22"/>
+        </w:rPr>
+        <w:t xml:space="preserve">That 200K context window means it can hold an entire 10,000-word article in memory without losing the thread. The writing reads less robotic than any other tool — it handles nuance, maintains consistent voice, and doesn't default to the "helpful assistant" tone that makes most AI content sound identical. I write all of BrightlyFuture's long-form guides with Claude as the drafting partner, and the raw output needs less cleanup than anything else I've tested.</w:t>
+      </w:r>
+    </w:p>
+    <w:p>
+      <w:pPr>
+        <w:spacing w:after="200"/>
+      </w:pPr>
+      <w:r>
+        <w:rPr>
+          <w:rFonts w:ascii="Calibri" w:cs="Calibri" w:eastAsia="Calibri" w:hAnsi="Calibri"/>
+          <w:b w:val="false"/>
+          <w:bCs w:val="false"/>
+          <w:i w:val="false"/>
+          <w:iCs w:val="false"/>
+          <w:color w:val="333333"/>
+          <w:sz w:val="22"/>
+          <w:szCs w:val="22"/>
+        </w:rPr>
+        <w:t xml:space="preserve">The Google Search Console results back this up. Every article on this blog was drafted with Claude, and the growth trajectory speaks for itself:</w:t>
+      </w:r>
+    </w:p>
+    <w:p>
+      <w:pPr>
+        <w:pStyle w:val="ListParagraph"/>
+        <w:numPr>
+          <w:ilvl w:val="0"/>
+          <w:numId w:val="1"/>
+        </w:numPr>
+        <w:spacing w:after="80"/>
+      </w:pPr>
+      <w:r>
+        <w:rPr>
+          <w:rFonts w:ascii="Calibri" w:cs="Calibri" w:eastAsia="Calibri" w:hAnsi="Calibri"/>
+          <w:b/>
+          <w:bCs/>
+          <w:i w:val="false"/>
+          <w:iCs w:val="false"/>
+          <w:color w:val="333333"/>
+          <w:sz w:val="22"/>
+          <w:szCs w:val="22"/>
+        </w:rPr>
+        <w:t xml:space="preserve">First three months</w:t>
+      </w:r>
+      <w:r>
+        <w:rPr>
+          <w:rFonts w:ascii="Calibri" w:cs="Calibri" w:eastAsia="Calibri" w:hAnsi="Calibri"/>
+          <w:b w:val="false"/>
+          <w:bCs w:val="false"/>
+          <w:i w:val="false"/>
+          <w:iCs w:val="false"/>
+          <w:color w:val="333333"/>
+          <w:sz w:val="22"/>
+          <w:szCs w:val="22"/>
+        </w:rPr>
+        <w:t xml:space="preserve"> (Feb–May 2026): 77 clicks, 20K impressions, average position 12.3</w:t>
+      </w:r>
+    </w:p>
+    <w:p>
+      <w:pPr>
+        <w:pStyle w:val="ListParagraph"/>
+        <w:numPr>
+          <w:ilvl w:val="0"/>
+          <w:numId w:val="1"/>
+        </w:numPr>
+        <w:spacing w:after="80"/>
+      </w:pPr>
+      <w:r>
+        <w:rPr>
+          <w:rFonts w:ascii="Calibri" w:cs="Calibri" w:eastAsia="Calibri" w:hAnsi="Calibri"/>
+          <w:b/>
+          <w:bCs/>
+          <w:i w:val="false"/>
+          <w:iCs w:val="false"/>
+          <w:color w:val="333333"/>
+          <w:sz w:val="22"/>
+          <w:szCs w:val="22"/>
+        </w:rPr>
+        <w:t xml:space="preserve">Months two through five</w:t>
+      </w:r>
+      <w:r>
+        <w:rPr>
+          <w:rFonts w:ascii="Calibri" w:cs="Calibri" w:eastAsia="Calibri" w:hAnsi="Calibri"/>
+          <w:b w:val="false"/>
+          <w:bCs w:val="false"/>
+          <w:i w:val="false"/>
+          <w:iCs w:val="false"/>
+          <w:color w:val="333333"/>
+          <w:sz w:val="22"/>
+          <w:szCs w:val="22"/>
+        </w:rPr>
+        <w:t xml:space="preserve"> (Mar–Jun 2026): 164 clicks, 43K impressions — traffic doubled</w:t>
+      </w:r>
+    </w:p>
+    <w:p>
+      <w:pPr>
+        <w:pStyle w:val="ListParagraph"/>
+        <w:numPr>
+          <w:ilvl w:val="0"/>
+          <w:numId w:val="1"/>
+        </w:numPr>
+        <w:spacing w:after="80"/>
+      </w:pPr>
+      <w:r>
+        <w:rPr>
+          <w:rFonts w:ascii="Calibri" w:cs="Calibri" w:eastAsia="Calibri" w:hAnsi="Calibri"/>
+          <w:b/>
+          <w:bCs/>
+          <w:i w:val="false"/>
+          <w:iCs w:val="false"/>
+          <w:color w:val="333333"/>
+          <w:sz w:val="22"/>
+          <w:szCs w:val="22"/>
+        </w:rPr>
+        <w:t xml:space="preserve">Latest three months</w:t>
+      </w:r>
+      <w:r>
+        <w:rPr>
+          <w:rFonts w:ascii="Calibri" w:cs="Calibri" w:eastAsia="Calibri" w:hAnsi="Calibri"/>
+          <w:b w:val="false"/>
+          <w:bCs w:val="false"/>
+          <w:i w:val="false"/>
+          <w:iCs w:val="false"/>
+          <w:color w:val="333333"/>
+          <w:sz w:val="22"/>
+          <w:szCs w:val="22"/>
+        </w:rPr>
+        <w:t xml:space="preserve"> (Apr–Jul 2026): 970 clicks, 186K impressions, average position climbed to 9 — and the curve is still pointing up</w:t>
+      </w:r>
+    </w:p>
+    <w:p>
+      <w:pPr>
+        <w:spacing w:after="200"/>
+      </w:pPr>
+      <w:r>
+        <w:rPr>
+          <w:rFonts w:ascii="Calibri" w:cs="Calibri" w:eastAsia="Calibri" w:hAnsi="Calibri"/>
+          <w:b/>
+          <w:bCs/>
+          <w:i/>
+          <w:iCs/>
+          <w:color w:val="555555"/>
+          <w:sz w:val="22"/>
+          <w:szCs w:val="22"/>
+        </w:rPr>
+        <w:t xml:space="preserve">[IMAGE: search-console-results-start.webp — Early Search Console results: 77 clicks, 20K impressions]</w:t>
+      </w:r>
+    </w:p>
+    <w:p>
+      <w:pPr>
+        <w:spacing w:after="200"/>
+      </w:pPr>
+      <w:r>
+        <w:rPr>
+          <w:rFonts w:ascii="Calibri" w:cs="Calibri" w:eastAsia="Calibri" w:hAnsi="Calibri"/>
+          <w:b/>
+          <w:bCs/>
+          <w:i/>
+          <w:iCs/>
+          <w:color w:val="555555"/>
+          <w:sz w:val="22"/>
+          <w:szCs w:val="22"/>
+        </w:rPr>
+        <w:t xml:space="preserve">[IMAGE: search-console-results-growth.webp — Growth stage: 164 clicks, 43K impressions]</w:t>
+      </w:r>
+    </w:p>
+    <w:p>
+      <w:pPr>
+        <w:spacing w:after="200"/>
+      </w:pPr>
+      <w:r>
+        <w:rPr>
+          <w:rFonts w:ascii="Calibri" w:cs="Calibri" w:eastAsia="Calibri" w:hAnsi="Calibri"/>
+          <w:b/>
+          <w:bCs/>
+          <w:i/>
+          <w:iCs/>
+          <w:color w:val="555555"/>
+          <w:sz w:val="22"/>
+          <w:szCs w:val="22"/>
+        </w:rPr>
+        <w:t xml:space="preserve">[IMAGE: search-console-results-current.webp — Current: 970 clicks, 186K impressions, position 9]</w:t>
+      </w:r>
+    </w:p>
+    <w:p>
+      <w:pPr>
+        <w:spacing w:after="200"/>
+      </w:pPr>
+      <w:r>
+        <w:rPr>
+          <w:rFonts w:ascii="Calibri" w:cs="Calibri" w:eastAsia="Calibri" w:hAnsi="Calibri"/>
+          <w:b/>
+          <w:bCs/>
+          <w:i w:val="false"/>
+          <w:iCs w:val="false"/>
+          <w:color w:val="333333"/>
+          <w:sz w:val="22"/>
+          <w:szCs w:val="22"/>
+        </w:rPr>
+        <w:t xml:space="preserve">Where it falls short: </w:t>
+      </w:r>
+      <w:r>
+        <w:rPr>
+          <w:rFonts w:ascii="Calibri" w:cs="Calibri" w:eastAsia="Calibri" w:hAnsi="Calibri"/>
+          <w:b w:val="false"/>
+          <w:bCs w:val="false"/>
+          <w:i w:val="false"/>
+          <w:iCs w:val="false"/>
+          <w:color w:val="333333"/>
+          <w:sz w:val="22"/>
+          <w:szCs w:val="22"/>
+        </w:rPr>
+        <w:t xml:space="preserve">Fewer free messages than ChatGPT. No web browsing on the free tier. No SEO features, no integrations, no publishing pipeline — you need a separate SEO tool, but you'd need that with ChatGPT too.</w:t>
+      </w:r>
+    </w:p>
+    <w:p>
+      <w:pPr>
+        <w:pStyle w:val="Heading3"/>
+        <w:spacing w:after="160" w:before="320"/>
+      </w:pPr>
+      <w:r>
+        <w:rPr>
+          <w:rFonts w:ascii="Calibri" w:cs="Calibri" w:eastAsia="Calibri" w:hAnsi="Calibri"/>
+          <w:b/>
+          <w:bCs/>
+          <w:color w:val="7C3AED"/>
+          <w:sz w:val="24"/>
+          <w:szCs w:val="24"/>
+        </w:rPr>
         <w:t xml:space="preserve">ChatGPT (OpenAI)</w:t>
       </w:r>
     </w:p>
@@ -566,7 +941,7 @@
           <w:sz w:val="22"/>
           <w:szCs w:val="22"/>
         </w:rPr>
-        <w:t xml:space="preserve">All-around blogging — brainstorming, outlining, drafting, editing</w:t>
+        <w:t xml:space="preserve">Brainstorming, image generation, research, quick drafts</w:t>
       </w:r>
     </w:p>
     <w:p>
@@ -648,7 +1023,7 @@
         </w:rPr>
         <w:t xml:space="preserve">ChatGPT is the most trusted AI tool among content marketers — 80% rank it as their top pick for reliability, according to </w:t>
       </w:r>
-      <w:hyperlink w:history="1" r:id="rId3ntz1xdcuqezzaubtocaf">
+      <w:hyperlink w:history="1" r:id="rIdu9hu5z70ks5kknrgwsy05">
         <w:r>
           <w:rPr>
             <w:rStyle w:val="Hyperlink"/>
@@ -672,25 +1047,43 @@
           <w:sz w:val="22"/>
           <w:szCs w:val="22"/>
         </w:rPr>
-        <w:t xml:space="preserve">. It processes 2.5 billion daily prompts and recently crossed 1 billion monthly active users. Those numbers exist because the tool flat-out works for most writing tasks — I've used it on at least 200 blog drafts myself.</w:t>
-      </w:r>
-    </w:p>
-    <w:p>
-      <w:pPr>
-        <w:spacing w:after="200"/>
-      </w:pPr>
-      <w:r>
-        <w:rPr>
-          <w:rFonts w:ascii="Calibri" w:cs="Calibri" w:eastAsia="Calibri" w:hAnsi="Calibri"/>
-          <w:b w:val="false"/>
-          <w:bCs w:val="false"/>
-          <w:i w:val="false"/>
-          <w:iCs w:val="false"/>
-          <w:color w:val="333333"/>
-          <w:sz w:val="22"/>
-          <w:szCs w:val="22"/>
-        </w:rPr>
-        <w:t xml:space="preserve">The free tier gives you GPT-4o mini — enough for brainstorming, outlines, and short drafts. For full blog posts, you'll hit quality ceilings. GPT-4o produces noticeably better long-form content, but free users get limited access.</w:t>
+        <w:t xml:space="preserve">. It processes 2.5 billion daily prompts and recently crossed 1 billion monthly active users. For brainstorming, outlining, and image generation through DALL-E, ChatGPT delivers — I use it regularly for blog featured images and social content visuals.</w:t>
+      </w:r>
+    </w:p>
+    <w:p>
+      <w:pPr>
+        <w:spacing w:after="200"/>
+      </w:pPr>
+      <w:r>
+        <w:rPr>
+          <w:rFonts w:ascii="Calibri" w:cs="Calibri" w:eastAsia="Calibri" w:hAnsi="Calibri"/>
+          <w:b w:val="false"/>
+          <w:bCs w:val="false"/>
+          <w:i w:val="false"/>
+          <w:iCs w:val="false"/>
+          <w:color w:val="333333"/>
+          <w:sz w:val="22"/>
+          <w:szCs w:val="22"/>
+        </w:rPr>
+        <w:t xml:space="preserve">But for structured blog writing? My experience has been frustrating. I set up a dedicated ChatGPT project with custom skills and detailed instructions — target keywords, required internal and external links, article structure, tone guidelines. It misses something roughly 90% of the time. Internal links get dropped from the final draft. External citations disappear. Specific formatting requirements get ignored. Even with a persistent project setup and saved instructions, the same problems keep repeating across new conversations.</w:t>
+      </w:r>
+    </w:p>
+    <w:p>
+      <w:pPr>
+        <w:spacing w:after="200"/>
+      </w:pPr>
+      <w:r>
+        <w:rPr>
+          <w:rFonts w:ascii="Calibri" w:cs="Calibri" w:eastAsia="Calibri" w:hAnsi="Calibri"/>
+          <w:b w:val="false"/>
+          <w:bCs w:val="false"/>
+          <w:i w:val="false"/>
+          <w:iCs w:val="false"/>
+          <w:color w:val="333333"/>
+          <w:sz w:val="22"/>
+          <w:szCs w:val="22"/>
+        </w:rPr>
+        <w:t xml:space="preserve">The free tier gives you GPT-4o mini — enough for brainstorming, outlines, and short drafts. GPT-4o produces noticeably better long-form content, but free users get limited access. For image generation, ChatGPT is my go-to — DALL-E produces clean blog graphics faster than designing them manually.</w:t>
       </w:r>
     </w:p>
     <w:p>
@@ -721,7 +1114,7 @@
           <w:sz w:val="22"/>
           <w:szCs w:val="22"/>
         </w:rPr>
-        <w:t xml:space="preserve">No built-in SEO features. No keyword data. No content scoring. It writes well, but it doesn't know what's ranking or what search intent looks like for your keyword. You need a separate tool for that.</w:t>
+        <w:t xml:space="preserve">Instruction-following accuracy on complex briefs is well below Claude. No built-in SEO features. No keyword data. No content scoring. It writes well in isolation, but it doesn't reliably follow multi-step blogging briefs.</w:t>
       </w:r>
     </w:p>
     <w:p>
@@ -738,7 +1131,7 @@
           <w:sz w:val="24"/>
           <w:szCs w:val="24"/>
         </w:rPr>
-        <w:t xml:space="preserve">Claude (Anthropic)</w:t>
+        <w:t xml:space="preserve">Google Gemini</w:t>
       </w:r>
     </w:p>
     <w:p>
@@ -769,7 +1162,7 @@
           <w:sz w:val="22"/>
           <w:szCs w:val="22"/>
         </w:rPr>
-        <w:t xml:space="preserve">Long-form writing, nuanced tone, detailed guides</w:t>
+        <w:t xml:space="preserve">Research, fact-checking, summaries with real-time data</w:t>
       </w:r>
     </w:p>
     <w:p>
@@ -800,7 +1193,7 @@
           <w:sz w:val="22"/>
           <w:szCs w:val="22"/>
         </w:rPr>
-        <w:t xml:space="preserve">Daily message limit, 200K token context window</w:t>
+        <w:t xml:space="preserve">Full access including image generation, Deep Research, and Canvas</w:t>
       </w:r>
     </w:p>
     <w:p>
@@ -831,43 +1224,61 @@
           <w:sz w:val="22"/>
           <w:szCs w:val="22"/>
         </w:rPr>
-        <w:t xml:space="preserve">Pro at $20/mo, Max at $100-200/mo</w:t>
-      </w:r>
-    </w:p>
-    <w:p>
-      <w:pPr>
-        <w:spacing w:after="200"/>
-      </w:pPr>
-      <w:r>
-        <w:rPr>
-          <w:rFonts w:ascii="Calibri" w:cs="Calibri" w:eastAsia="Calibri" w:hAnsi="Calibri"/>
-          <w:b w:val="false"/>
-          <w:bCs w:val="false"/>
-          <w:i w:val="false"/>
-          <w:iCs w:val="false"/>
-          <w:color w:val="333333"/>
-          <w:sz w:val="22"/>
-          <w:szCs w:val="22"/>
-        </w:rPr>
-        <w:t xml:space="preserve">Claude produces the most human-sounding prose of any AI tool available right now. Multiple independent reviews confirm this — the writing reads less robotic, handles nuance better, and maintains consistent voice across long articles. That 200K context window means it can hold an entire 10,000-word article in memory without losing the thread.</w:t>
-      </w:r>
-    </w:p>
-    <w:p>
-      <w:pPr>
-        <w:spacing w:after="200"/>
-      </w:pPr>
-      <w:r>
-        <w:rPr>
-          <w:rFonts w:ascii="Calibri" w:cs="Calibri" w:eastAsia="Calibri" w:hAnsi="Calibri"/>
-          <w:b w:val="false"/>
-          <w:bCs w:val="false"/>
-          <w:i w:val="false"/>
-          <w:iCs w:val="false"/>
-          <w:color w:val="333333"/>
-          <w:sz w:val="22"/>
-          <w:szCs w:val="22"/>
-        </w:rPr>
-        <w:t xml:space="preserve">For blog writing specifically, Claude handles detailed guides and opinion pieces better than ChatGPT. It doesn't default to the "helpful assistant" tone that makes most AI content sound identical. I write most of BrightlyFuture's long-form guides with Claude as the drafting partner — the raw output needs less cleanup than any other tool I've tested.</w:t>
+        <w:t xml:space="preserve">Gemini Advanced at $20/mo (included with Google One AI Premium)</w:t>
+      </w:r>
+    </w:p>
+    <w:p>
+      <w:pPr>
+        <w:spacing w:after="200"/>
+      </w:pPr>
+      <w:r>
+        <w:rPr>
+          <w:rFonts w:ascii="Calibri" w:cs="Calibri" w:eastAsia="Calibri" w:hAnsi="Calibri"/>
+          <w:b w:val="false"/>
+          <w:bCs w:val="false"/>
+          <w:i w:val="false"/>
+          <w:iCs w:val="false"/>
+          <w:color w:val="333333"/>
+          <w:sz w:val="22"/>
+          <w:szCs w:val="22"/>
+        </w:rPr>
+        <w:t xml:space="preserve">Gemini's edge is integration. It connects directly to Google Search, Gmail, Docs, and the rest of the Google ecosystem. For bloggers who research and write inside Google Workspace, there's less friction than switching between tabs.</w:t>
+      </w:r>
+    </w:p>
+    <w:p>
+      <w:pPr>
+        <w:spacing w:after="200"/>
+      </w:pPr>
+      <w:r>
+        <w:rPr>
+          <w:rFonts w:ascii="Calibri" w:cs="Calibri" w:eastAsia="Calibri" w:hAnsi="Calibri"/>
+          <w:b w:val="false"/>
+          <w:bCs w:val="false"/>
+          <w:i w:val="false"/>
+          <w:iCs w:val="false"/>
+          <w:color w:val="333333"/>
+          <w:sz w:val="22"/>
+          <w:szCs w:val="22"/>
+        </w:rPr>
+        <w:t xml:space="preserve">The Deep Research feature is worth trying — it pulls together information from multiple sources and presents it with citations, similar to Perplexity but with deeper Google Search integration. For research, Gemini is solid. For blog writing, my experience hasn't been strong — the output hedges more than ChatGPT or Claude, adding phrases like "it's important to consider" and "one might argue" that need cutting.</w:t>
+      </w:r>
+    </w:p>
+    <w:p>
+      <w:pPr>
+        <w:spacing w:after="200"/>
+      </w:pPr>
+      <w:r>
+        <w:rPr>
+          <w:rFonts w:ascii="Calibri" w:cs="Calibri" w:eastAsia="Calibri" w:hAnsi="Calibri"/>
+          <w:b w:val="false"/>
+          <w:bCs w:val="false"/>
+          <w:i w:val="false"/>
+          <w:iCs w:val="false"/>
+          <w:color w:val="333333"/>
+          <w:sz w:val="22"/>
+          <w:szCs w:val="22"/>
+        </w:rPr>
+        <w:t xml:space="preserve">Image generation works but with a quirk — generated images often include built-in logos or watermark-like elements that look awkward in blog posts and need manual cleanup. Video generation produces 8-second clips that work for general content. I've tried it for exercise movement videos, and the results are hit or miss — sometimes the movement is accurate, sometimes it doesn't match what I described at all.</w:t>
       </w:r>
     </w:p>
     <w:p>
@@ -898,7 +1309,7 @@
           <w:sz w:val="22"/>
           <w:szCs w:val="22"/>
         </w:rPr>
-        <w:t xml:space="preserve">Fewer free messages than ChatGPT. No web browsing on the free tier. No SEO features, no integrations, no publishing pipeline.</w:t>
+        <w:t xml:space="preserve">Writing tone leans overly cautious and needs heavier humanization than Claude. Image generation includes awkward logos. Video generation is limited to 8 seconds with inconsistent quality for specific use cases. Best used for research, not drafting.</w:t>
       </w:r>
     </w:p>
     <w:p>
@@ -915,7 +1326,7 @@
           <w:sz w:val="24"/>
           <w:szCs w:val="24"/>
         </w:rPr>
-        <w:t xml:space="preserve">Google Gemini</w:t>
+        <w:t xml:space="preserve">Grok (xAI)</w:t>
       </w:r>
     </w:p>
     <w:p>
@@ -946,7 +1357,7 @@
           <w:sz w:val="22"/>
           <w:szCs w:val="22"/>
         </w:rPr>
-        <w:t xml:space="preserve">Research, fact-checking, summaries with real-time data</w:t>
+        <w:t xml:space="preserve">Real-time data, latest research and statistics, image generation</w:t>
       </w:r>
     </w:p>
     <w:p>
@@ -977,7 +1388,7 @@
           <w:sz w:val="22"/>
           <w:szCs w:val="22"/>
         </w:rPr>
-        <w:t xml:space="preserve">Full access including image generation, Deep Research, and Canvas</w:t>
+        <w:t xml:space="preserve">Grok 3 Mini on grok.com and X</w:t>
       </w:r>
     </w:p>
     <w:p>
@@ -1008,43 +1419,43 @@
           <w:sz w:val="22"/>
           <w:szCs w:val="22"/>
         </w:rPr>
-        <w:t xml:space="preserve">Gemini Advanced at $20/mo (included with Google One AI Premium)</w:t>
-      </w:r>
-    </w:p>
-    <w:p>
-      <w:pPr>
-        <w:spacing w:after="200"/>
-      </w:pPr>
-      <w:r>
-        <w:rPr>
-          <w:rFonts w:ascii="Calibri" w:cs="Calibri" w:eastAsia="Calibri" w:hAnsi="Calibri"/>
-          <w:b w:val="false"/>
-          <w:bCs w:val="false"/>
-          <w:i w:val="false"/>
-          <w:iCs w:val="false"/>
-          <w:color w:val="333333"/>
-          <w:sz w:val="22"/>
-          <w:szCs w:val="22"/>
-        </w:rPr>
-        <w:t xml:space="preserve">Gemini's edge is integration. It connects directly to Google Search, Gmail, Docs, and the rest of the Google ecosystem. For bloggers who research and write inside Google Workspace, there's less friction than switching between tabs.</w:t>
-      </w:r>
-    </w:p>
-    <w:p>
-      <w:pPr>
-        <w:spacing w:after="200"/>
-      </w:pPr>
-      <w:r>
-        <w:rPr>
-          <w:rFonts w:ascii="Calibri" w:cs="Calibri" w:eastAsia="Calibri" w:hAnsi="Calibri"/>
-          <w:b w:val="false"/>
-          <w:bCs w:val="false"/>
-          <w:i w:val="false"/>
-          <w:iCs w:val="false"/>
-          <w:color w:val="333333"/>
-          <w:sz w:val="22"/>
-          <w:szCs w:val="22"/>
-        </w:rPr>
-        <w:t xml:space="preserve">The Deep Research feature is worth trying — it pulls together information from multiple sources and presents it with citations, similar to Perplexity but with deeper Google Search integration.</w:t>
+        <w:t xml:space="preserve">X Premium+ at $16/mo, SuperGrok at $30/mo</w:t>
+      </w:r>
+    </w:p>
+    <w:p>
+      <w:pPr>
+        <w:spacing w:after="200"/>
+      </w:pPr>
+      <w:r>
+        <w:rPr>
+          <w:rFonts w:ascii="Calibri" w:cs="Calibri" w:eastAsia="Calibri" w:hAnsi="Calibri"/>
+          <w:b w:val="false"/>
+          <w:bCs w:val="false"/>
+          <w:i w:val="false"/>
+          <w:iCs w:val="false"/>
+          <w:color w:val="333333"/>
+          <w:sz w:val="22"/>
+          <w:szCs w:val="22"/>
+        </w:rPr>
+        <w:t xml:space="preserve">Grok is xAI's AI assistant, and its biggest advantage is real-time data access. While ChatGPT and Claude work from training data with cutoff dates, Grok pulls live information from X (formerly Twitter) and the open web. For bloggers writing about trending topics, current statistics, or fast-moving industries like AI and tech, that real-time edge fills a gap no other tool on this list covers.</w:t>
+      </w:r>
+    </w:p>
+    <w:p>
+      <w:pPr>
+        <w:spacing w:after="200"/>
+      </w:pPr>
+      <w:r>
+        <w:rPr>
+          <w:rFonts w:ascii="Calibri" w:cs="Calibri" w:eastAsia="Calibri" w:hAnsi="Calibri"/>
+          <w:b w:val="false"/>
+          <w:bCs w:val="false"/>
+          <w:i w:val="false"/>
+          <w:iCs w:val="false"/>
+          <w:color w:val="333333"/>
+          <w:sz w:val="22"/>
+          <w:szCs w:val="22"/>
+        </w:rPr>
+        <w:t xml:space="preserve">I use Grok for two specific things: pulling the latest research and statistics when writing data-heavy articles, and generating images when I need quick visuals. Image generation through Aurora produces clean, realistic images without the awkward logos that Gemini adds. The DeepSearch feature digs deeper than a standard web search — valuable during the research phase when you need verified, up-to-date numbers that other AI tools might hallucinate from outdated training data.</w:t>
       </w:r>
     </w:p>
     <w:p>
@@ -1075,7 +1486,7 @@
           <w:sz w:val="22"/>
           <w:szCs w:val="22"/>
         </w:rPr>
-        <w:t xml:space="preserve">Writing tone leans overly cautious. It hedges more than ChatGPT or Claude, which means more editing to remove "it's important to consider" and "one might argue" phrases. The output needs heavier humanization work.</w:t>
+        <w:t xml:space="preserve">Not a drafting tool — the writing output isn't on Claude's level for long-form blog posts. Think of Grok as a research and image generation complement to your primary writing tool, not a replacement. The free tier (Grok 3 Mini) is limited in capability. Real value requires X Premium+ ($16/mo) or SuperGrok ($30/mo).</w:t>
       </w:r>
     </w:p>
     <w:p>
@@ -1203,25 +1614,25 @@
           <w:sz w:val="22"/>
           <w:szCs w:val="22"/>
         </w:rPr>
-        <w:t xml:space="preserve">Perplexity isn't a writing tool — it's a research tool that happens to write well. Every answer comes with numbered citations linked to the original source, which solves the biggest problem with AI-generated content: making up statistics.</w:t>
-      </w:r>
-    </w:p>
-    <w:p>
-      <w:pPr>
-        <w:spacing w:after="200"/>
-      </w:pPr>
-      <w:r>
-        <w:rPr>
-          <w:rFonts w:ascii="Calibri" w:cs="Calibri" w:eastAsia="Calibri" w:hAnsi="Calibri"/>
-          <w:b w:val="false"/>
-          <w:bCs w:val="false"/>
-          <w:i w:val="false"/>
-          <w:iCs w:val="false"/>
-          <w:color w:val="333333"/>
-          <w:sz w:val="22"/>
-          <w:szCs w:val="22"/>
-        </w:rPr>
-        <w:t xml:space="preserve">Use it at the research stage. Ask it for statistics, competing perspectives, and expert quotes on your topic. Copy the cited sources into your article. Then switch to ChatGPT or Claude for the actual writing.</w:t>
+        <w:t xml:space="preserve">Perplexity isn't a writing tool — it's a research tool that happens to write well. Every answer comes with numbered citations linked to the original source, which solves the biggest problem with AI-generated content: making up statistics. I use it alongside Grok at the research stage — Perplexity for cited sources and academic references, Grok for real-time data and trending information.</w:t>
+      </w:r>
+    </w:p>
+    <w:p>
+      <w:pPr>
+        <w:spacing w:after="200"/>
+      </w:pPr>
+      <w:r>
+        <w:rPr>
+          <w:rFonts w:ascii="Calibri" w:cs="Calibri" w:eastAsia="Calibri" w:hAnsi="Calibri"/>
+          <w:b w:val="false"/>
+          <w:bCs w:val="false"/>
+          <w:i w:val="false"/>
+          <w:iCs w:val="false"/>
+          <w:color w:val="333333"/>
+          <w:sz w:val="22"/>
+          <w:szCs w:val="22"/>
+        </w:rPr>
+        <w:t xml:space="preserve">Use it before you start drafting. Ask for statistics, competing perspectives, and expert quotes on your topic. Copy the cited sources into your brief. Then switch to Claude for the actual writing. That research-then-draft workflow catches hallucinated stats before they make it into your published article.</w:t>
       </w:r>
     </w:p>
     <w:p>
@@ -1253,6 +1664,59 @@
           <w:szCs w:val="22"/>
         </w:rPr>
         <w:t xml:space="preserve">Not designed for long-form drafting. The Pro search has daily caps on free tier. Output is structured like a research summary, not a blog post.</w:t>
+      </w:r>
+    </w:p>
+    <w:p>
+      <w:pPr>
+        <w:pStyle w:val="Heading2"/>
+        <w:spacing w:after="160" w:before="320"/>
+      </w:pPr>
+      <w:r>
+        <w:rPr>
+          <w:rFonts w:ascii="Calibri" w:cs="Calibri" w:eastAsia="Calibri" w:hAnsi="Calibri"/>
+          <w:b/>
+          <w:bCs/>
+          <w:color w:val="7C3AED"/>
+          <w:sz w:val="28"/>
+          <w:szCs w:val="28"/>
+        </w:rPr>
+        <w:t xml:space="preserve">Which Paid AI Writing Tools Are Worth the Money?</w:t>
+      </w:r>
+    </w:p>
+    <w:p>
+      <w:pPr>
+        <w:spacing w:after="200"/>
+      </w:pPr>
+      <w:r>
+        <w:rPr>
+          <w:rFonts w:ascii="Calibri" w:cs="Calibri" w:eastAsia="Calibri" w:hAnsi="Calibri"/>
+          <w:b w:val="false"/>
+          <w:bCs w:val="false"/>
+          <w:i w:val="false"/>
+          <w:iCs w:val="false"/>
+          <w:color w:val="333333"/>
+          <w:sz w:val="22"/>
+          <w:szCs w:val="22"/>
+        </w:rPr>
+        <w:t xml:space="preserve">Paid tools earn their price in one of two ways: they either bundle SEO data and workflow features that free tools lack, or they save hours of manual work each week through automation. If a paid tool doesn't do at least one of these, it's a dressed-up ChatGPT wrapper charging you for a different UI.</w:t>
+      </w:r>
+    </w:p>
+    <w:p>
+      <w:pPr>
+        <w:spacing w:after="200"/>
+      </w:pPr>
+      <w:r>
+        <w:rPr>
+          <w:rFonts w:ascii="Calibri" w:cs="Calibri" w:eastAsia="Calibri" w:hAnsi="Calibri"/>
+          <w:b/>
+          <w:bCs/>
+          <w:i/>
+          <w:iCs/>
+          <w:color w:val="555555"/>
+          <w:sz w:val="22"/>
+          <w:szCs w:val="22"/>
+        </w:rPr>
+        <w:t xml:space="preserve">[IMAGE: paid-ai-blog-writing-tools-pricing-comparison.webp]</w:t>
       </w:r>
     </w:p>
     <w:p>
@@ -1269,7 +1733,7 @@
           <w:sz w:val="24"/>
           <w:szCs w:val="24"/>
         </w:rPr>
-        <w:t xml:space="preserve">Rytr</w:t>
+        <w:t xml:space="preserve">Koala AI</w:t>
       </w:r>
     </w:p>
     <w:p>
@@ -1300,171 +1764,105 @@
           <w:sz w:val="22"/>
           <w:szCs w:val="22"/>
         </w:rPr>
-        <w:t xml:space="preserve">Beginners who need templates and guidance</w:t>
-      </w:r>
-    </w:p>
-    <w:p>
-      <w:pPr>
-        <w:spacing w:after="200"/>
-      </w:pPr>
-      <w:r>
-        <w:rPr>
-          <w:rFonts w:ascii="Calibri" w:cs="Calibri" w:eastAsia="Calibri" w:hAnsi="Calibri"/>
-          <w:b/>
-          <w:bCs/>
-          <w:i w:val="false"/>
-          <w:iCs w:val="false"/>
-          <w:color w:val="333333"/>
-          <w:sz w:val="22"/>
-          <w:szCs w:val="22"/>
-        </w:rPr>
-        <w:t xml:space="preserve">Free tier: </w:t>
-      </w:r>
-      <w:r>
-        <w:rPr>
-          <w:rFonts w:ascii="Calibri" w:cs="Calibri" w:eastAsia="Calibri" w:hAnsi="Calibri"/>
-          <w:b w:val="false"/>
-          <w:bCs w:val="false"/>
-          <w:i w:val="false"/>
-          <w:iCs w:val="false"/>
-          <w:color w:val="333333"/>
-          <w:sz w:val="22"/>
-          <w:szCs w:val="22"/>
-        </w:rPr>
-        <w:t xml:space="preserve">10,000 characters/month, 20+ tones, Chrome extension</w:t>
-      </w:r>
-    </w:p>
-    <w:p>
-      <w:pPr>
-        <w:spacing w:after="200"/>
-      </w:pPr>
-      <w:r>
-        <w:rPr>
-          <w:rFonts w:ascii="Calibri" w:cs="Calibri" w:eastAsia="Calibri" w:hAnsi="Calibri"/>
-          <w:b/>
-          <w:bCs/>
-          <w:i w:val="false"/>
-          <w:iCs w:val="false"/>
-          <w:color w:val="333333"/>
-          <w:sz w:val="22"/>
-          <w:szCs w:val="22"/>
-        </w:rPr>
-        <w:t xml:space="preserve">Paid: </w:t>
-      </w:r>
-      <w:r>
-        <w:rPr>
-          <w:rFonts w:ascii="Calibri" w:cs="Calibri" w:eastAsia="Calibri" w:hAnsi="Calibri"/>
-          <w:b w:val="false"/>
-          <w:bCs w:val="false"/>
-          <w:i w:val="false"/>
-          <w:iCs w:val="false"/>
-          <w:color w:val="333333"/>
-          <w:sz w:val="22"/>
-          <w:szCs w:val="22"/>
-        </w:rPr>
-        <w:t xml:space="preserve">Unlimited at $9/mo ($7.50/mo billed annually)</w:t>
-      </w:r>
-    </w:p>
-    <w:p>
-      <w:pPr>
-        <w:spacing w:after="200"/>
-      </w:pPr>
-      <w:r>
-        <w:rPr>
-          <w:rFonts w:ascii="Calibri" w:cs="Calibri" w:eastAsia="Calibri" w:hAnsi="Calibri"/>
-          <w:b w:val="false"/>
-          <w:bCs w:val="false"/>
-          <w:i w:val="false"/>
-          <w:iCs w:val="false"/>
-          <w:color w:val="333333"/>
-          <w:sz w:val="22"/>
-          <w:szCs w:val="22"/>
-        </w:rPr>
-        <w:t xml:space="preserve">Rytr has the most generous no-strings-attached free tier among dedicated writing platforms — 10,000 characters monthly with no credit card required. For bloggers publishing one or two short posts a month, it covers the basics. Over 8 million users have signed up, largely because the entry barrier is zero.</w:t>
-      </w:r>
-    </w:p>
-    <w:p>
-      <w:pPr>
-        <w:spacing w:after="200"/>
-      </w:pPr>
-      <w:r>
-        <w:rPr>
-          <w:rFonts w:ascii="Calibri" w:cs="Calibri" w:eastAsia="Calibri" w:hAnsi="Calibri"/>
-          <w:b/>
-          <w:bCs/>
-          <w:i w:val="false"/>
-          <w:iCs w:val="false"/>
-          <w:color w:val="333333"/>
-          <w:sz w:val="22"/>
-          <w:szCs w:val="22"/>
-        </w:rPr>
-        <w:t xml:space="preserve">Where it falls short: </w:t>
-      </w:r>
-      <w:r>
-        <w:rPr>
-          <w:rFonts w:ascii="Calibri" w:cs="Calibri" w:eastAsia="Calibri" w:hAnsi="Calibri"/>
-          <w:b w:val="false"/>
-          <w:bCs w:val="false"/>
-          <w:i w:val="false"/>
-          <w:iCs w:val="false"/>
-          <w:color w:val="333333"/>
-          <w:sz w:val="22"/>
-          <w:szCs w:val="22"/>
-        </w:rPr>
-        <w:t xml:space="preserve">Output quality sits below ChatGPT and Claude. The 10,000-character limit means roughly 1,500-2,000 words — enough for one short article. If you're writing a comprehensive guide, you'll hit the ceiling mid-draft.</w:t>
-      </w:r>
-    </w:p>
-    <w:p>
-      <w:pPr>
-        <w:pStyle w:val="Heading2"/>
-        <w:spacing w:after="160" w:before="320"/>
-      </w:pPr>
-      <w:r>
-        <w:rPr>
-          <w:rFonts w:ascii="Calibri" w:cs="Calibri" w:eastAsia="Calibri" w:hAnsi="Calibri"/>
-          <w:b/>
-          <w:bCs/>
-          <w:color w:val="7C3AED"/>
-          <w:sz w:val="28"/>
-          <w:szCs w:val="28"/>
-        </w:rPr>
-        <w:t xml:space="preserve">Which Paid AI Writing Tools Are Worth the Money?</w:t>
-      </w:r>
-    </w:p>
-    <w:p>
-      <w:pPr>
-        <w:spacing w:after="200"/>
-      </w:pPr>
-      <w:r>
-        <w:rPr>
-          <w:rFonts w:ascii="Calibri" w:cs="Calibri" w:eastAsia="Calibri" w:hAnsi="Calibri"/>
-          <w:b w:val="false"/>
-          <w:bCs w:val="false"/>
-          <w:i w:val="false"/>
-          <w:iCs w:val="false"/>
-          <w:color w:val="333333"/>
-          <w:sz w:val="22"/>
-          <w:szCs w:val="22"/>
-        </w:rPr>
-        <w:t xml:space="preserve">Paid tools earn their price in one of two ways: they either produce significantly better output than free alternatives, or they bundle SEO data, publishing pipelines, and workflow features that save hours of manual work each week. If a paid tool doesn't do at least one of these, it's a dressed-up ChatGPT wrapper.</w:t>
-      </w:r>
-    </w:p>
-    <w:p>
-      <w:pPr>
-        <w:spacing w:after="200"/>
-      </w:pPr>
-      <w:r>
-        <w:rPr>
-          <w:rFonts w:ascii="Calibri" w:cs="Calibri" w:eastAsia="Calibri" w:hAnsi="Calibri"/>
-          <w:b/>
-          <w:bCs/>
-          <w:i/>
-          <w:iCs/>
-          <w:color w:val="555555"/>
-          <w:sz w:val="22"/>
-          <w:szCs w:val="22"/>
-        </w:rPr>
-        <w:t xml:space="preserve">[IMAGE: paid-ai-blog-writing-tools-pricing-comparison.webp]</w:t>
+        <w:t xml:space="preserve">SEO-driven blog posts, affiliate content, one-click WordPress publishing</w:t>
+      </w:r>
+    </w:p>
+    <w:p>
+      <w:pPr>
+        <w:spacing w:after="200"/>
+      </w:pPr>
+      <w:r>
+        <w:rPr>
+          <w:rFonts w:ascii="Calibri" w:cs="Calibri" w:eastAsia="Calibri" w:hAnsi="Calibri"/>
+          <w:b/>
+          <w:bCs/>
+          <w:i w:val="false"/>
+          <w:iCs w:val="false"/>
+          <w:color w:val="333333"/>
+          <w:sz w:val="22"/>
+          <w:szCs w:val="22"/>
+        </w:rPr>
+        <w:t xml:space="preserve">Pricing: </w:t>
+      </w:r>
+      <w:r>
+        <w:rPr>
+          <w:rFonts w:ascii="Calibri" w:cs="Calibri" w:eastAsia="Calibri" w:hAnsi="Calibri"/>
+          <w:b w:val="false"/>
+          <w:bCs w:val="false"/>
+          <w:i w:val="false"/>
+          <w:iCs w:val="false"/>
+          <w:color w:val="333333"/>
+          <w:sz w:val="22"/>
+          <w:szCs w:val="22"/>
+        </w:rPr>
+        <w:t xml:space="preserve">Essentials $9/mo, Starter $25/mo, Professional $49/mo</w:t>
+      </w:r>
+    </w:p>
+    <w:p>
+      <w:pPr>
+        <w:spacing w:after="200"/>
+      </w:pPr>
+      <w:r>
+        <w:rPr>
+          <w:rFonts w:ascii="Calibri" w:cs="Calibri" w:eastAsia="Calibri" w:hAnsi="Calibri"/>
+          <w:b w:val="false"/>
+          <w:bCs w:val="false"/>
+          <w:i w:val="false"/>
+          <w:iCs w:val="false"/>
+          <w:color w:val="333333"/>
+          <w:sz w:val="22"/>
+          <w:szCs w:val="22"/>
+        </w:rPr>
+        <w:t xml:space="preserve">Koala stands out for one reason: you give it a keyword, and it produces a 2,000-3,000 word article in under two minutes with headers, internal linking suggestions, and FAQ sections baked in. The Professional plan adds Deep Research — it scrapes the top SERP results for your keyword and builds the article around what's already ranking.</w:t>
+      </w:r>
+    </w:p>
+    <w:p>
+      <w:pPr>
+        <w:spacing w:after="200"/>
+      </w:pPr>
+      <w:r>
+        <w:rPr>
+          <w:rFonts w:ascii="Calibri" w:cs="Calibri" w:eastAsia="Calibri" w:hAnsi="Calibri"/>
+          <w:b w:val="false"/>
+          <w:bCs w:val="false"/>
+          <w:i w:val="false"/>
+          <w:iCs w:val="false"/>
+          <w:color w:val="333333"/>
+          <w:sz w:val="22"/>
+          <w:szCs w:val="22"/>
+        </w:rPr>
+        <w:t xml:space="preserve">For affiliate bloggers, there's a feature none of the big-name tools offer. Paste an Amazon ASIN or product URL, and Koala generates a full product review article from the actual product data. That alone is worth the $9 entry price for anyone in affiliate marketing. I've used Koala for quick product-focused drafts when I need SEO structure fast — it handles the skeleton, and I rewrite the voice manually.</w:t>
+      </w:r>
+    </w:p>
+    <w:p>
+      <w:pPr>
+        <w:spacing w:after="200"/>
+      </w:pPr>
+      <w:r>
+        <w:rPr>
+          <w:rFonts w:ascii="Calibri" w:cs="Calibri" w:eastAsia="Calibri" w:hAnsi="Calibri"/>
+          <w:b/>
+          <w:bCs/>
+          <w:i w:val="false"/>
+          <w:iCs w:val="false"/>
+          <w:color w:val="333333"/>
+          <w:sz w:val="22"/>
+          <w:szCs w:val="22"/>
+        </w:rPr>
+        <w:t xml:space="preserve">The catch: </w:t>
+      </w:r>
+      <w:r>
+        <w:rPr>
+          <w:rFonts w:ascii="Calibri" w:cs="Calibri" w:eastAsia="Calibri" w:hAnsi="Calibri"/>
+          <w:b w:val="false"/>
+          <w:bCs w:val="false"/>
+          <w:i w:val="false"/>
+          <w:iCs w:val="false"/>
+          <w:color w:val="333333"/>
+          <w:sz w:val="22"/>
+          <w:szCs w:val="22"/>
+        </w:rPr>
+        <w:t xml:space="preserve">Output still needs humanization. Koala writes fast, not distinctively. Every article follows similar structural patterns, which means a blog full of Koala posts starts sounding uniform. And the writing quality doesn't match Claude — treat it as a first-draft machine for SEO structure, not a publish button.</w:t>
       </w:r>
     </w:p>
     <w:p>
@@ -1481,7 +1879,7 @@
           <w:sz w:val="24"/>
           <w:szCs w:val="24"/>
         </w:rPr>
-        <w:t xml:space="preserve">Koala AI</w:t>
+        <w:t xml:space="preserve">NeuronWriter</w:t>
       </w:r>
     </w:p>
     <w:p>
@@ -1512,7 +1910,7 @@
           <w:sz w:val="22"/>
           <w:szCs w:val="22"/>
         </w:rPr>
-        <w:t xml:space="preserve">SEO-driven blog posts, affiliate content, one-click WordPress publishing</w:t>
+        <w:t xml:space="preserve">Budget NLP content scoring, SEO optimization on a solo blogger's budget</w:t>
       </w:r>
     </w:p>
     <w:p>
@@ -1543,43 +1941,43 @@
           <w:sz w:val="22"/>
           <w:szCs w:val="22"/>
         </w:rPr>
-        <w:t xml:space="preserve">Essentials $9/mo, Starter $25/mo, Professional $49/mo</w:t>
-      </w:r>
-    </w:p>
-    <w:p>
-      <w:pPr>
-        <w:spacing w:after="200"/>
-      </w:pPr>
-      <w:r>
-        <w:rPr>
-          <w:rFonts w:ascii="Calibri" w:cs="Calibri" w:eastAsia="Calibri" w:hAnsi="Calibri"/>
-          <w:b w:val="false"/>
-          <w:bCs w:val="false"/>
-          <w:i w:val="false"/>
-          <w:iCs w:val="false"/>
-          <w:color w:val="333333"/>
-          <w:sz w:val="22"/>
-          <w:szCs w:val="22"/>
-        </w:rPr>
-        <w:t xml:space="preserve">Koala stands out for one reason: you give it a keyword, and it produces a 2,000-3,000 word article in under two minutes with headers, internal linking suggestions, and FAQ sections baked in. The Professional plan adds Deep Research — it scrapes the top SERP results for your keyword and builds the article around what's already ranking.</w:t>
-      </w:r>
-    </w:p>
-    <w:p>
-      <w:pPr>
-        <w:spacing w:after="200"/>
-      </w:pPr>
-      <w:r>
-        <w:rPr>
-          <w:rFonts w:ascii="Calibri" w:cs="Calibri" w:eastAsia="Calibri" w:hAnsi="Calibri"/>
-          <w:b w:val="false"/>
-          <w:bCs w:val="false"/>
-          <w:i w:val="false"/>
-          <w:iCs w:val="false"/>
-          <w:color w:val="333333"/>
-          <w:sz w:val="22"/>
-          <w:szCs w:val="22"/>
-        </w:rPr>
-        <w:t xml:space="preserve">For affiliate bloggers, there's a feature none of the big-name tools offer. Paste an Amazon ASIN or product URL, and Koala generates a full product review article from the actual product data. That alone is worth the $9 entry price for anyone in affiliate marketing.</w:t>
+        <w:t xml:space="preserve">$23/mo ($19/mo billed annually)</w:t>
+      </w:r>
+    </w:p>
+    <w:p>
+      <w:pPr>
+        <w:spacing w:after="200"/>
+      </w:pPr>
+      <w:r>
+        <w:rPr>
+          <w:rFonts w:ascii="Calibri" w:cs="Calibri" w:eastAsia="Calibri" w:hAnsi="Calibri"/>
+          <w:b w:val="false"/>
+          <w:bCs w:val="false"/>
+          <w:i w:val="false"/>
+          <w:iCs w:val="false"/>
+          <w:color w:val="333333"/>
+          <w:sz w:val="22"/>
+          <w:szCs w:val="22"/>
+        </w:rPr>
+        <w:t xml:space="preserve">NeuronWriter does what Surfer does — NLP-based content scoring against SERP data — at less than half the price. Feed it your target keyword, and it analyzes the top-ranking pages, identifies missing topics and entities, and scores your draft as you write. For solo bloggers who need real SEO optimization but can't justify $49+/month, NeuronWriter fills the gap.</w:t>
+      </w:r>
+    </w:p>
+    <w:p>
+      <w:pPr>
+        <w:spacing w:after="200"/>
+      </w:pPr>
+      <w:r>
+        <w:rPr>
+          <w:rFonts w:ascii="Calibri" w:cs="Calibri" w:eastAsia="Calibri" w:hAnsi="Calibri"/>
+          <w:b w:val="false"/>
+          <w:bCs w:val="false"/>
+          <w:i w:val="false"/>
+          <w:iCs w:val="false"/>
+          <w:color w:val="333333"/>
+          <w:sz w:val="22"/>
+          <w:szCs w:val="22"/>
+        </w:rPr>
+        <w:t xml:space="preserve">I use NeuronWriter for most of BrightlyFuture's content. The NLP scoring catches keyword gaps and entity coverage issues I'd miss manually. At $19/month on annual billing, it's the cheapest legitimate SEO optimization tool available — and the content scores have been accurate enough to guide my optimization decisions on every article I've published.</w:t>
       </w:r>
     </w:p>
     <w:p>
@@ -1610,7 +2008,7 @@
           <w:sz w:val="22"/>
           <w:szCs w:val="22"/>
         </w:rPr>
-        <w:t xml:space="preserve">Output still needs humanization. Koala writes fast, not distinctively. Every article follows similar structural patterns, which means a blog full of Koala posts starts sounding uniform. Treat it as a first-draft machine, not a publish button.</w:t>
+        <w:t xml:space="preserve">The interface isn't as polished as Surfer's. SERP data is less comprehensive — for high-competition keywords, Surfer's deeper analysis is worth the premium. NeuronWriter covers 85% of what Surfer does at 40% of the price. For most solo bloggers, that's more than enough.</w:t>
       </w:r>
     </w:p>
     <w:p>
@@ -1627,6 +2025,152 @@
           <w:sz w:val="24"/>
           <w:szCs w:val="24"/>
         </w:rPr>
+        <w:t xml:space="preserve">Surfer AI</w:t>
+      </w:r>
+    </w:p>
+    <w:p>
+      <w:pPr>
+        <w:spacing w:after="200"/>
+      </w:pPr>
+      <w:r>
+        <w:rPr>
+          <w:rFonts w:ascii="Calibri" w:cs="Calibri" w:eastAsia="Calibri" w:hAnsi="Calibri"/>
+          <w:b/>
+          <w:bCs/>
+          <w:i w:val="false"/>
+          <w:iCs w:val="false"/>
+          <w:color w:val="333333"/>
+          <w:sz w:val="22"/>
+          <w:szCs w:val="22"/>
+        </w:rPr>
+        <w:t xml:space="preserve">Best for: </w:t>
+      </w:r>
+      <w:r>
+        <w:rPr>
+          <w:rFonts w:ascii="Calibri" w:cs="Calibri" w:eastAsia="Calibri" w:hAnsi="Calibri"/>
+          <w:b w:val="false"/>
+          <w:bCs w:val="false"/>
+          <w:i w:val="false"/>
+          <w:iCs w:val="false"/>
+          <w:color w:val="333333"/>
+          <w:sz w:val="22"/>
+          <w:szCs w:val="22"/>
+        </w:rPr>
+        <w:t xml:space="preserve">Real-time SEO content scoring, NLP optimization, competitive keyword analysis</w:t>
+      </w:r>
+    </w:p>
+    <w:p>
+      <w:pPr>
+        <w:spacing w:after="200"/>
+      </w:pPr>
+      <w:r>
+        <w:rPr>
+          <w:rFonts w:ascii="Calibri" w:cs="Calibri" w:eastAsia="Calibri" w:hAnsi="Calibri"/>
+          <w:b/>
+          <w:bCs/>
+          <w:i w:val="false"/>
+          <w:iCs w:val="false"/>
+          <w:color w:val="333333"/>
+          <w:sz w:val="22"/>
+          <w:szCs w:val="22"/>
+        </w:rPr>
+        <w:t xml:space="preserve">Pricing: </w:t>
+      </w:r>
+      <w:r>
+        <w:rPr>
+          <w:rFonts w:ascii="Calibri" w:cs="Calibri" w:eastAsia="Calibri" w:hAnsi="Calibri"/>
+          <w:b w:val="false"/>
+          <w:bCs w:val="false"/>
+          <w:i w:val="false"/>
+          <w:iCs w:val="false"/>
+          <w:color w:val="333333"/>
+          <w:sz w:val="22"/>
+          <w:szCs w:val="22"/>
+        </w:rPr>
+        <w:t xml:space="preserve">From $49/mo</w:t>
+      </w:r>
+    </w:p>
+    <w:p>
+      <w:pPr>
+        <w:spacing w:after="200"/>
+      </w:pPr>
+      <w:r>
+        <w:rPr>
+          <w:rFonts w:ascii="Calibri" w:cs="Calibri" w:eastAsia="Calibri" w:hAnsi="Calibri"/>
+          <w:b w:val="false"/>
+          <w:bCs w:val="false"/>
+          <w:i w:val="false"/>
+          <w:iCs w:val="false"/>
+          <w:color w:val="333333"/>
+          <w:sz w:val="22"/>
+          <w:szCs w:val="22"/>
+        </w:rPr>
+        <w:t xml:space="preserve">Surfer doesn't generate articles from scratch — it scores your content in real time against what's ranking. Write a paragraph, and Surfer tells you which keywords are missing, where your heading structure needs work, and how your article compares to the top 10 results.</w:t>
+      </w:r>
+    </w:p>
+    <w:p>
+      <w:pPr>
+        <w:spacing w:after="200"/>
+      </w:pPr>
+      <w:r>
+        <w:rPr>
+          <w:rFonts w:ascii="Calibri" w:cs="Calibri" w:eastAsia="Calibri" w:hAnsi="Calibri"/>
+          <w:b w:val="false"/>
+          <w:bCs w:val="false"/>
+          <w:i w:val="false"/>
+          <w:iCs w:val="false"/>
+          <w:color w:val="333333"/>
+          <w:sz w:val="22"/>
+          <w:szCs w:val="22"/>
+        </w:rPr>
+        <w:t xml:space="preserve">Surfer AI (the auto-writing feature) produces full articles optimized against SERP data. The output quality got noticeably better in 2026, and the new GEO scoring feature measures citation-readiness for AI search engines — a forward-looking addition none of the cheaper tools offer yet. I use NeuronWriter for day-to-day content but pull in Surfer when I'm targeting high-value, competitive keywords where deeper SERP analysis makes the difference between page one and page two.</w:t>
+      </w:r>
+    </w:p>
+    <w:p>
+      <w:pPr>
+        <w:spacing w:after="200"/>
+      </w:pPr>
+      <w:r>
+        <w:rPr>
+          <w:rFonts w:ascii="Calibri" w:cs="Calibri" w:eastAsia="Calibri" w:hAnsi="Calibri"/>
+          <w:b/>
+          <w:bCs/>
+          <w:i w:val="false"/>
+          <w:iCs w:val="false"/>
+          <w:color w:val="333333"/>
+          <w:sz w:val="22"/>
+          <w:szCs w:val="22"/>
+        </w:rPr>
+        <w:t xml:space="preserve">The catch: </w:t>
+      </w:r>
+      <w:r>
+        <w:rPr>
+          <w:rFonts w:ascii="Calibri" w:cs="Calibri" w:eastAsia="Calibri" w:hAnsi="Calibri"/>
+          <w:b w:val="false"/>
+          <w:bCs w:val="false"/>
+          <w:i w:val="false"/>
+          <w:iCs w:val="false"/>
+          <w:color w:val="333333"/>
+          <w:sz w:val="22"/>
+          <w:szCs w:val="22"/>
+        </w:rPr>
+        <w:t xml:space="preserve">$49/month is steep if you only need basic content scoring. NeuronWriter offers similar NLP-based content analysis at $23/month ($19/month billed annually) — a fraction of the cost. But Surfer's SERP data is more comprehensive and accurate. The right choice depends on your keyword competition level and budget.</w:t>
+      </w:r>
+    </w:p>
+    <w:p>
+      <w:pPr>
+        <w:pStyle w:val="Heading3"/>
+        <w:spacing w:after="160" w:before="320"/>
+      </w:pPr>
+      <w:r>
+        <w:rPr>
+          <w:rFonts w:ascii="Calibri" w:cs="Calibri" w:eastAsia="Calibri" w:hAnsi="Calibri"/>
+          <w:b/>
+          <w:bCs/>
+          <w:color w:val="7C3AED"/>
+          <w:sz w:val="24"/>
+          <w:szCs w:val="24"/>
+        </w:rPr>
         <w:t xml:space="preserve">Jasper AI</w:t>
       </w:r>
     </w:p>
@@ -1707,27 +2251,27 @@
           <w:sz w:val="22"/>
           <w:szCs w:val="22"/>
         </w:rPr>
-        <w:t xml:space="preserve">Jasper's Brand Voice feature is its only genuine differentiator. Feed it your existing content, and it learns your tone, terminology, and style patterns. For a marketing team producing blog posts, emails, ads, and social content that all need to sound like the same brand, this matters.</w:t>
-      </w:r>
-    </w:p>
-    <w:p>
-      <w:pPr>
-        <w:spacing w:after="200"/>
-      </w:pPr>
-      <w:r>
-        <w:rPr>
-          <w:rFonts w:ascii="Calibri" w:cs="Calibri" w:eastAsia="Calibri" w:hAnsi="Calibri"/>
-          <w:b w:val="false"/>
-          <w:bCs w:val="false"/>
-          <w:i w:val="false"/>
-          <w:iCs w:val="false"/>
-          <w:color w:val="333333"/>
-          <w:sz w:val="22"/>
-          <w:szCs w:val="22"/>
-        </w:rPr>
-        <w:t xml:space="preserve">For solo bloggers? It's hard to justify $49/month when ChatGPT Plus costs $20 and produces comparable writing quality. </w:t>
-      </w:r>
-      <w:hyperlink w:history="1" r:id="rIdoxk2vq4ireyhxgfrjnvl2">
+        <w:t xml:space="preserve">Jasper's Brand Voice feature is its only real differentiator. Feed it your existing content, and it learns your tone, terminology, and style patterns. For a marketing team producing blog posts, emails, ads, and social content that all need to sound like the same brand, this matters.</w:t>
+      </w:r>
+    </w:p>
+    <w:p>
+      <w:pPr>
+        <w:spacing w:after="200"/>
+      </w:pPr>
+      <w:r>
+        <w:rPr>
+          <w:rFonts w:ascii="Calibri" w:cs="Calibri" w:eastAsia="Calibri" w:hAnsi="Calibri"/>
+          <w:b w:val="false"/>
+          <w:bCs w:val="false"/>
+          <w:i w:val="false"/>
+          <w:iCs w:val="false"/>
+          <w:color w:val="333333"/>
+          <w:sz w:val="22"/>
+          <w:szCs w:val="22"/>
+        </w:rPr>
+        <w:t xml:space="preserve">For solo bloggers? It's hard to justify $49/month when Claude produces comparable — honestly, better — writing quality for free. </w:t>
+      </w:r>
+      <w:hyperlink w:history="1" r:id="rIdfv32jwhljn-gohomq8wy-">
         <w:r>
           <w:rPr>
             <w:rStyle w:val="Hyperlink"/>
@@ -1751,7 +2295,7 @@
           <w:sz w:val="22"/>
           <w:szCs w:val="22"/>
         </w:rPr>
-        <w:t xml:space="preserve"> note that Claude and ChatGPT have surpassed Jasper's core writing quality at less than half the price — you're paying for the brand voice layer, templates, and team collaboration features on top. I tested both side by side on the same 2,000-word brief. Jasper's output needed the same amount of editing as Claude's. The difference? Claude was free.</w:t>
+        <w:t xml:space="preserve"> note that Claude and ChatGPT have surpassed Jasper's core writing quality at less than half the price — you're paying for the brand voice layer, templates, and team collaboration features on top. I tested Jasper side by side against Claude on the same 2,000-word brief. Jasper's output needed the same amount of editing, didn't follow my structural requirements as closely, and cost $49/month more. For normal blog posts, Claude's free tier outperforms Jasper's paid plan.</w:t>
       </w:r>
     </w:p>
     <w:p>
@@ -1933,6 +2477,77 @@
     </w:p>
     <w:p>
       <w:pPr>
+        <w:pStyle w:val="Heading2"/>
+        <w:spacing w:after="160" w:before="320"/>
+      </w:pPr>
+      <w:r>
+        <w:rPr>
+          <w:rFonts w:ascii="Calibri" w:cs="Calibri" w:eastAsia="Calibri" w:hAnsi="Calibri"/>
+          <w:b/>
+          <w:bCs/>
+          <w:color w:val="7C3AED"/>
+          <w:sz w:val="28"/>
+          <w:szCs w:val="28"/>
+        </w:rPr>
+        <w:t xml:space="preserve">How Do You Pick the Right AI Writing Tool for Your Blog?</w:t>
+      </w:r>
+    </w:p>
+    <w:p>
+      <w:pPr>
+        <w:spacing w:after="200"/>
+      </w:pPr>
+      <w:r>
+        <w:rPr>
+          <w:rFonts w:ascii="Calibri" w:cs="Calibri" w:eastAsia="Calibri" w:hAnsi="Calibri"/>
+          <w:b w:val="false"/>
+          <w:bCs w:val="false"/>
+          <w:i w:val="false"/>
+          <w:iCs w:val="false"/>
+          <w:color w:val="333333"/>
+          <w:sz w:val="22"/>
+          <w:szCs w:val="22"/>
+        </w:rPr>
+        <w:t xml:space="preserve">Match the tool to your bottleneck — the one step in your blogging workflow that takes the most time or produces the weakest results. Buying a tool that solves a problem you don't have is the most common mistake bloggers make.</w:t>
+      </w:r>
+    </w:p>
+    <w:p>
+      <w:pPr>
+        <w:spacing w:after="200"/>
+      </w:pPr>
+      <w:r>
+        <w:rPr>
+          <w:rFonts w:ascii="Calibri" w:cs="Calibri" w:eastAsia="Calibri" w:hAnsi="Calibri"/>
+          <w:b/>
+          <w:bCs/>
+          <w:i/>
+          <w:iCs/>
+          <w:color w:val="555555"/>
+          <w:sz w:val="22"/>
+          <w:szCs w:val="22"/>
+        </w:rPr>
+        <w:t xml:space="preserve">[IMAGE: how-to-choose-ai-blog-writing-tool-flowchart.webp]</w:t>
+      </w:r>
+    </w:p>
+    <w:p>
+      <w:pPr>
+        <w:spacing w:after="200"/>
+      </w:pPr>
+      <w:r>
+        <w:rPr>
+          <w:rFonts w:ascii="Calibri" w:cs="Calibri" w:eastAsia="Calibri" w:hAnsi="Calibri"/>
+          <w:b w:val="false"/>
+          <w:bCs w:val="false"/>
+          <w:i w:val="false"/>
+          <w:iCs w:val="false"/>
+          <w:color w:val="333333"/>
+          <w:sz w:val="22"/>
+          <w:szCs w:val="22"/>
+        </w:rPr>
+        <w:t xml:space="preserve">Pick your tier based on where you are right now:</w:t>
+      </w:r>
+    </w:p>
+    <w:p>
+      <w:pPr>
         <w:pStyle w:val="Heading3"/>
         <w:spacing w:after="160" w:before="320"/>
       </w:pPr>
@@ -1945,643 +2560,6 @@
           <w:sz w:val="24"/>
           <w:szCs w:val="24"/>
         </w:rPr>
-        <w:t xml:space="preserve">Frase</w:t>
-      </w:r>
-    </w:p>
-    <w:p>
-      <w:pPr>
-        <w:spacing w:after="200"/>
-      </w:pPr>
-      <w:r>
-        <w:rPr>
-          <w:rFonts w:ascii="Calibri" w:cs="Calibri" w:eastAsia="Calibri" w:hAnsi="Calibri"/>
-          <w:b/>
-          <w:bCs/>
-          <w:i w:val="false"/>
-          <w:iCs w:val="false"/>
-          <w:color w:val="333333"/>
-          <w:sz w:val="22"/>
-          <w:szCs w:val="22"/>
-        </w:rPr>
-        <w:t xml:space="preserve">Best for: </w:t>
-      </w:r>
-      <w:r>
-        <w:rPr>
-          <w:rFonts w:ascii="Calibri" w:cs="Calibri" w:eastAsia="Calibri" w:hAnsi="Calibri"/>
-          <w:b w:val="false"/>
-          <w:bCs w:val="false"/>
-          <w:i w:val="false"/>
-          <w:iCs w:val="false"/>
-          <w:color w:val="333333"/>
-          <w:sz w:val="22"/>
-          <w:szCs w:val="22"/>
-        </w:rPr>
-        <w:t xml:space="preserve">Content research, SERP analysis, content briefs</w:t>
-      </w:r>
-    </w:p>
-    <w:p>
-      <w:pPr>
-        <w:spacing w:after="200"/>
-      </w:pPr>
-      <w:r>
-        <w:rPr>
-          <w:rFonts w:ascii="Calibri" w:cs="Calibri" w:eastAsia="Calibri" w:hAnsi="Calibri"/>
-          <w:b/>
-          <w:bCs/>
-          <w:i w:val="false"/>
-          <w:iCs w:val="false"/>
-          <w:color w:val="333333"/>
-          <w:sz w:val="22"/>
-          <w:szCs w:val="22"/>
-        </w:rPr>
-        <w:t xml:space="preserve">Pricing: </w:t>
-      </w:r>
-      <w:r>
-        <w:rPr>
-          <w:rFonts w:ascii="Calibri" w:cs="Calibri" w:eastAsia="Calibri" w:hAnsi="Calibri"/>
-          <w:b w:val="false"/>
-          <w:bCs w:val="false"/>
-          <w:i w:val="false"/>
-          <w:iCs w:val="false"/>
-          <w:color w:val="333333"/>
-          <w:sz w:val="22"/>
-          <w:szCs w:val="22"/>
-        </w:rPr>
-        <w:t xml:space="preserve">Starter $49/mo ($39/mo annual), Professional $129/mo, Scale $299/mo</w:t>
-      </w:r>
-    </w:p>
-    <w:p>
-      <w:pPr>
-        <w:spacing w:after="200"/>
-      </w:pPr>
-      <w:r>
-        <w:rPr>
-          <w:rFonts w:ascii="Calibri" w:cs="Calibri" w:eastAsia="Calibri" w:hAnsi="Calibri"/>
-          <w:b w:val="false"/>
-          <w:bCs w:val="false"/>
-          <w:i w:val="false"/>
-          <w:iCs w:val="false"/>
-          <w:color w:val="333333"/>
-          <w:sz w:val="22"/>
-          <w:szCs w:val="22"/>
-        </w:rPr>
-        <w:t xml:space="preserve">Frase doesn't try to be a writer — it's a research and optimization platform that happens to include an AI draft feature. In about 30 seconds, it scrapes the top 20 ranking pages for your keyword, identifies which topics they cover, finds the gaps, and builds a content brief you can write from or hand to the AI. In May 2026, Frase added an AI Agent with 80+ skills that automates entire content briefs from a single keyword — a real time-saver if you produce briefs regularly.</w:t>
-      </w:r>
-    </w:p>
-    <w:p>
-      <w:pPr>
-        <w:spacing w:after="200"/>
-      </w:pPr>
-      <w:r>
-        <w:rPr>
-          <w:rFonts w:ascii="Calibri" w:cs="Calibri" w:eastAsia="Calibri" w:hAnsi="Calibri"/>
-          <w:b w:val="false"/>
-          <w:bCs w:val="false"/>
-          <w:i w:val="false"/>
-          <w:iCs w:val="false"/>
-          <w:color w:val="333333"/>
-          <w:sz w:val="22"/>
-          <w:szCs w:val="22"/>
-        </w:rPr>
-        <w:t xml:space="preserve">Why does that matter? Most AI writing tools ignore competitive analysis. They write in a vacuum. Frase writes based on what's actually working on page one of Google right now.</w:t>
-      </w:r>
-    </w:p>
-    <w:p>
-      <w:pPr>
-        <w:spacing w:after="200"/>
-      </w:pPr>
-      <w:r>
-        <w:rPr>
-          <w:rFonts w:ascii="Calibri" w:cs="Calibri" w:eastAsia="Calibri" w:hAnsi="Calibri"/>
-          <w:b/>
-          <w:bCs/>
-          <w:i w:val="false"/>
-          <w:iCs w:val="false"/>
-          <w:color w:val="333333"/>
-          <w:sz w:val="22"/>
-          <w:szCs w:val="22"/>
-        </w:rPr>
-        <w:t xml:space="preserve">The catch: </w:t>
-      </w:r>
-      <w:r>
-        <w:rPr>
-          <w:rFonts w:ascii="Calibri" w:cs="Calibri" w:eastAsia="Calibri" w:hAnsi="Calibri"/>
-          <w:b w:val="false"/>
-          <w:bCs w:val="false"/>
-          <w:i w:val="false"/>
-          <w:iCs w:val="false"/>
-          <w:color w:val="333333"/>
-          <w:sz w:val="22"/>
-          <w:szCs w:val="22"/>
-        </w:rPr>
-        <w:t xml:space="preserve">Frase's pricing jumped hard — the old Solo plan at $15/mo is gone, replaced by Starter at $49/mo. That's a 3x increase that prices out many solo bloggers. The Starter plan covers 1 user and 1 domain. If you're publishing 8-10 posts a month, the query limits feel tight. The AI writing quality is decent but not as polished as Claude or ChatGPT — use Frase for research and briefs, then draft elsewhere.</w:t>
-      </w:r>
-    </w:p>
-    <w:p>
-      <w:pPr>
-        <w:pStyle w:val="Heading3"/>
-        <w:spacing w:after="160" w:before="320"/>
-      </w:pPr>
-      <w:r>
-        <w:rPr>
-          <w:rFonts w:ascii="Calibri" w:cs="Calibri" w:eastAsia="Calibri" w:hAnsi="Calibri"/>
-          <w:b/>
-          <w:bCs/>
-          <w:color w:val="7C3AED"/>
-          <w:sz w:val="24"/>
-          <w:szCs w:val="24"/>
-        </w:rPr>
-        <w:t xml:space="preserve">Surfer AI</w:t>
-      </w:r>
-    </w:p>
-    <w:p>
-      <w:pPr>
-        <w:spacing w:after="200"/>
-      </w:pPr>
-      <w:r>
-        <w:rPr>
-          <w:rFonts w:ascii="Calibri" w:cs="Calibri" w:eastAsia="Calibri" w:hAnsi="Calibri"/>
-          <w:b/>
-          <w:bCs/>
-          <w:i w:val="false"/>
-          <w:iCs w:val="false"/>
-          <w:color w:val="333333"/>
-          <w:sz w:val="22"/>
-          <w:szCs w:val="22"/>
-        </w:rPr>
-        <w:t xml:space="preserve">Best for: </w:t>
-      </w:r>
-      <w:r>
-        <w:rPr>
-          <w:rFonts w:ascii="Calibri" w:cs="Calibri" w:eastAsia="Calibri" w:hAnsi="Calibri"/>
-          <w:b w:val="false"/>
-          <w:bCs w:val="false"/>
-          <w:i w:val="false"/>
-          <w:iCs w:val="false"/>
-          <w:color w:val="333333"/>
-          <w:sz w:val="22"/>
-          <w:szCs w:val="22"/>
-        </w:rPr>
-        <w:t xml:space="preserve">Real-time SEO content scoring, NLP optimization</w:t>
-      </w:r>
-    </w:p>
-    <w:p>
-      <w:pPr>
-        <w:spacing w:after="200"/>
-      </w:pPr>
-      <w:r>
-        <w:rPr>
-          <w:rFonts w:ascii="Calibri" w:cs="Calibri" w:eastAsia="Calibri" w:hAnsi="Calibri"/>
-          <w:b/>
-          <w:bCs/>
-          <w:i w:val="false"/>
-          <w:iCs w:val="false"/>
-          <w:color w:val="333333"/>
-          <w:sz w:val="22"/>
-          <w:szCs w:val="22"/>
-        </w:rPr>
-        <w:t xml:space="preserve">Pricing: </w:t>
-      </w:r>
-      <w:r>
-        <w:rPr>
-          <w:rFonts w:ascii="Calibri" w:cs="Calibri" w:eastAsia="Calibri" w:hAnsi="Calibri"/>
-          <w:b w:val="false"/>
-          <w:bCs w:val="false"/>
-          <w:i w:val="false"/>
-          <w:iCs w:val="false"/>
-          <w:color w:val="333333"/>
-          <w:sz w:val="22"/>
-          <w:szCs w:val="22"/>
-        </w:rPr>
-        <w:t xml:space="preserve">From $49/mo</w:t>
-      </w:r>
-    </w:p>
-    <w:p>
-      <w:pPr>
-        <w:spacing w:after="200"/>
-      </w:pPr>
-      <w:r>
-        <w:rPr>
-          <w:rFonts w:ascii="Calibri" w:cs="Calibri" w:eastAsia="Calibri" w:hAnsi="Calibri"/>
-          <w:b w:val="false"/>
-          <w:bCs w:val="false"/>
-          <w:i w:val="false"/>
-          <w:iCs w:val="false"/>
-          <w:color w:val="333333"/>
-          <w:sz w:val="22"/>
-          <w:szCs w:val="22"/>
-        </w:rPr>
-        <w:t xml:space="preserve">Surfer doesn't generate articles from scratch — it scores your content in real time against what's ranking. Write a paragraph, and Surfer tells you which keywords are missing, where your heading structure needs work, and how your article compares to the top 10 results.</w:t>
-      </w:r>
-    </w:p>
-    <w:p>
-      <w:pPr>
-        <w:spacing w:after="200"/>
-      </w:pPr>
-      <w:r>
-        <w:rPr>
-          <w:rFonts w:ascii="Calibri" w:cs="Calibri" w:eastAsia="Calibri" w:hAnsi="Calibri"/>
-          <w:b w:val="false"/>
-          <w:bCs w:val="false"/>
-          <w:i w:val="false"/>
-          <w:iCs w:val="false"/>
-          <w:color w:val="333333"/>
-          <w:sz w:val="22"/>
-          <w:szCs w:val="22"/>
-        </w:rPr>
-        <w:t xml:space="preserve">Surfer AI (the auto-writing feature) produces full articles optimized against SERP data. The output quality got noticeably better in 2026, but it still works better as an optimization layer on top of your own writing than as a standalone writer.</w:t>
-      </w:r>
-    </w:p>
-    <w:p>
-      <w:pPr>
-        <w:spacing w:after="200"/>
-      </w:pPr>
-      <w:r>
-        <w:rPr>
-          <w:rFonts w:ascii="Calibri" w:cs="Calibri" w:eastAsia="Calibri" w:hAnsi="Calibri"/>
-          <w:b/>
-          <w:bCs/>
-          <w:i w:val="false"/>
-          <w:iCs w:val="false"/>
-          <w:color w:val="333333"/>
-          <w:sz w:val="22"/>
-          <w:szCs w:val="22"/>
-        </w:rPr>
-        <w:t xml:space="preserve">The catch: </w:t>
-      </w:r>
-      <w:r>
-        <w:rPr>
-          <w:rFonts w:ascii="Calibri" w:cs="Calibri" w:eastAsia="Calibri" w:hAnsi="Calibri"/>
-          <w:b w:val="false"/>
-          <w:bCs w:val="false"/>
-          <w:i w:val="false"/>
-          <w:iCs w:val="false"/>
-          <w:color w:val="333333"/>
-          <w:sz w:val="22"/>
-          <w:szCs w:val="22"/>
-        </w:rPr>
-        <w:t xml:space="preserve">$49/month is steep if you only need the content score. NeuronWriter offers similar NLP-based content analysis at $23/month ($19/month billed annually) — a fraction of the cost. But Surfer's SERP data is more comprehensive and accurate. I use NeuronWriter for most of my own content and only pull in Surfer when I need deeper competitive analysis on high-value keywords.</w:t>
-      </w:r>
-    </w:p>
-    <w:p>
-      <w:pPr>
-        <w:pStyle w:val="Heading3"/>
-        <w:spacing w:after="160" w:before="320"/>
-      </w:pPr>
-      <w:r>
-        <w:rPr>
-          <w:rFonts w:ascii="Calibri" w:cs="Calibri" w:eastAsia="Calibri" w:hAnsi="Calibri"/>
-          <w:b/>
-          <w:bCs/>
-          <w:color w:val="7C3AED"/>
-          <w:sz w:val="24"/>
-          <w:szCs w:val="24"/>
-        </w:rPr>
-        <w:t xml:space="preserve">SEOWriting AI</w:t>
-      </w:r>
-    </w:p>
-    <w:p>
-      <w:pPr>
-        <w:spacing w:after="200"/>
-      </w:pPr>
-      <w:r>
-        <w:rPr>
-          <w:rFonts w:ascii="Calibri" w:cs="Calibri" w:eastAsia="Calibri" w:hAnsi="Calibri"/>
-          <w:b/>
-          <w:bCs/>
-          <w:i w:val="false"/>
-          <w:iCs w:val="false"/>
-          <w:color w:val="333333"/>
-          <w:sz w:val="22"/>
-          <w:szCs w:val="22"/>
-        </w:rPr>
-        <w:t xml:space="preserve">Best for: </w:t>
-      </w:r>
-      <w:r>
-        <w:rPr>
-          <w:rFonts w:ascii="Calibri" w:cs="Calibri" w:eastAsia="Calibri" w:hAnsi="Calibri"/>
-          <w:b w:val="false"/>
-          <w:bCs w:val="false"/>
-          <w:i w:val="false"/>
-          <w:iCs w:val="false"/>
-          <w:color w:val="333333"/>
-          <w:sz w:val="22"/>
-          <w:szCs w:val="22"/>
-        </w:rPr>
-        <w:t xml:space="preserve">Budget SEO blog posts, WordPress auto-publishing</w:t>
-      </w:r>
-    </w:p>
-    <w:p>
-      <w:pPr>
-        <w:spacing w:after="200"/>
-      </w:pPr>
-      <w:r>
-        <w:rPr>
-          <w:rFonts w:ascii="Calibri" w:cs="Calibri" w:eastAsia="Calibri" w:hAnsi="Calibri"/>
-          <w:b/>
-          <w:bCs/>
-          <w:i w:val="false"/>
-          <w:iCs w:val="false"/>
-          <w:color w:val="333333"/>
-          <w:sz w:val="22"/>
-          <w:szCs w:val="22"/>
-        </w:rPr>
-        <w:t xml:space="preserve">Pricing: </w:t>
-      </w:r>
-      <w:r>
-        <w:rPr>
-          <w:rFonts w:ascii="Calibri" w:cs="Calibri" w:eastAsia="Calibri" w:hAnsi="Calibri"/>
-          <w:b w:val="false"/>
-          <w:bCs w:val="false"/>
-          <w:i w:val="false"/>
-          <w:iCs w:val="false"/>
-          <w:color w:val="333333"/>
-          <w:sz w:val="22"/>
-          <w:szCs w:val="22"/>
-        </w:rPr>
-        <w:t xml:space="preserve">Starter $14/mo, Professional $59/mo</w:t>
-      </w:r>
-    </w:p>
-    <w:p>
-      <w:pPr>
-        <w:spacing w:after="200"/>
-      </w:pPr>
-      <w:r>
-        <w:rPr>
-          <w:rFonts w:ascii="Calibri" w:cs="Calibri" w:eastAsia="Calibri" w:hAnsi="Calibri"/>
-          <w:b w:val="false"/>
-          <w:bCs w:val="false"/>
-          <w:i w:val="false"/>
-          <w:iCs w:val="false"/>
-          <w:color w:val="333333"/>
-          <w:sz w:val="22"/>
-          <w:szCs w:val="22"/>
-        </w:rPr>
-        <w:t xml:space="preserve">SEOWriting AI is built specifically for bloggers who want SEO-optimized articles published directly to WordPress. The workflow is keyword in, article out, published to your blog — minimal manual intervention. At $14/month for the starter plan, it's one of the cheapest dedicated options.</w:t>
-      </w:r>
-    </w:p>
-    <w:p>
-      <w:pPr>
-        <w:spacing w:after="200"/>
-      </w:pPr>
-      <w:r>
-        <w:rPr>
-          <w:rFonts w:ascii="Calibri" w:cs="Calibri" w:eastAsia="Calibri" w:hAnsi="Calibri"/>
-          <w:b/>
-          <w:bCs/>
-          <w:i w:val="false"/>
-          <w:iCs w:val="false"/>
-          <w:color w:val="333333"/>
-          <w:sz w:val="22"/>
-          <w:szCs w:val="22"/>
-        </w:rPr>
-        <w:t xml:space="preserve">The catch: </w:t>
-      </w:r>
-      <w:r>
-        <w:rPr>
-          <w:rFonts w:ascii="Calibri" w:cs="Calibri" w:eastAsia="Calibri" w:hAnsi="Calibri"/>
-          <w:b w:val="false"/>
-          <w:bCs w:val="false"/>
-          <w:i w:val="false"/>
-          <w:iCs w:val="false"/>
-          <w:color w:val="333333"/>
-          <w:sz w:val="22"/>
-          <w:szCs w:val="22"/>
-        </w:rPr>
-        <w:t xml:space="preserve">The auto-publish convenience is also its weakness. Less manual intervention means less humanization. Articles need post-publish editing to avoid the generic AI tone that Google's helpful content system is designed to spot.</w:t>
-      </w:r>
-    </w:p>
-    <w:p>
-      <w:pPr>
-        <w:pStyle w:val="Heading3"/>
-        <w:spacing w:after="160" w:before="320"/>
-      </w:pPr>
-      <w:r>
-        <w:rPr>
-          <w:rFonts w:ascii="Calibri" w:cs="Calibri" w:eastAsia="Calibri" w:hAnsi="Calibri"/>
-          <w:b/>
-          <w:bCs/>
-          <w:color w:val="7C3AED"/>
-          <w:sz w:val="24"/>
-          <w:szCs w:val="24"/>
-        </w:rPr>
-        <w:t xml:space="preserve">Copy.ai</w:t>
-      </w:r>
-    </w:p>
-    <w:p>
-      <w:pPr>
-        <w:spacing w:after="200"/>
-      </w:pPr>
-      <w:r>
-        <w:rPr>
-          <w:rFonts w:ascii="Calibri" w:cs="Calibri" w:eastAsia="Calibri" w:hAnsi="Calibri"/>
-          <w:b/>
-          <w:bCs/>
-          <w:i w:val="false"/>
-          <w:iCs w:val="false"/>
-          <w:color w:val="333333"/>
-          <w:sz w:val="22"/>
-          <w:szCs w:val="22"/>
-        </w:rPr>
-        <w:t xml:space="preserve">Best for: </w:t>
-      </w:r>
-      <w:r>
-        <w:rPr>
-          <w:rFonts w:ascii="Calibri" w:cs="Calibri" w:eastAsia="Calibri" w:hAnsi="Calibri"/>
-          <w:b w:val="false"/>
-          <w:bCs w:val="false"/>
-          <w:i w:val="false"/>
-          <w:iCs w:val="false"/>
-          <w:color w:val="333333"/>
-          <w:sz w:val="22"/>
-          <w:szCs w:val="22"/>
-        </w:rPr>
-        <w:t xml:space="preserve">Marketing teams, go-to-market workflows, short-form content at scale</w:t>
-      </w:r>
-    </w:p>
-    <w:p>
-      <w:pPr>
-        <w:spacing w:after="200"/>
-      </w:pPr>
-      <w:r>
-        <w:rPr>
-          <w:rFonts w:ascii="Calibri" w:cs="Calibri" w:eastAsia="Calibri" w:hAnsi="Calibri"/>
-          <w:b/>
-          <w:bCs/>
-          <w:i w:val="false"/>
-          <w:iCs w:val="false"/>
-          <w:color w:val="333333"/>
-          <w:sz w:val="22"/>
-          <w:szCs w:val="22"/>
-        </w:rPr>
-        <w:t xml:space="preserve">Pricing: </w:t>
-      </w:r>
-      <w:r>
-        <w:rPr>
-          <w:rFonts w:ascii="Calibri" w:cs="Calibri" w:eastAsia="Calibri" w:hAnsi="Calibri"/>
-          <w:b w:val="false"/>
-          <w:bCs w:val="false"/>
-          <w:i w:val="false"/>
-          <w:iCs w:val="false"/>
-          <w:color w:val="333333"/>
-          <w:sz w:val="22"/>
-          <w:szCs w:val="22"/>
-        </w:rPr>
-        <w:t xml:space="preserve">Free (2,000 words/mo), Chat $29/mo, Pro $49/mo</w:t>
-      </w:r>
-    </w:p>
-    <w:p>
-      <w:pPr>
-        <w:spacing w:after="200"/>
-      </w:pPr>
-      <w:r>
-        <w:rPr>
-          <w:rFonts w:ascii="Calibri" w:cs="Calibri" w:eastAsia="Calibri" w:hAnsi="Calibri"/>
-          <w:b w:val="false"/>
-          <w:bCs w:val="false"/>
-          <w:i w:val="false"/>
-          <w:iCs w:val="false"/>
-          <w:color w:val="333333"/>
-          <w:sz w:val="22"/>
-          <w:szCs w:val="22"/>
-        </w:rPr>
-        <w:t xml:space="preserve">Copy.ai started as a short-form copywriting tool and evolved into a full go-to-market AI platform. The free tier gives you 2,000 words monthly with access to 90+ templates — enough for testing but not for regular blogging. Where Copy.ai actually shines is automating repetitive marketing workflows: product descriptions, social posts, email sequences, and ad copy. Over 15 million users have signed up, making it one of the most widely adopted AI writing platforms after ChatGPT.</w:t>
-      </w:r>
-    </w:p>
-    <w:p>
-      <w:pPr>
-        <w:spacing w:after="200"/>
-      </w:pPr>
-      <w:r>
-        <w:rPr>
-          <w:rFonts w:ascii="Calibri" w:cs="Calibri" w:eastAsia="Calibri" w:hAnsi="Calibri"/>
-          <w:b w:val="false"/>
-          <w:bCs w:val="false"/>
-          <w:i w:val="false"/>
-          <w:iCs w:val="false"/>
-          <w:color w:val="333333"/>
-          <w:sz w:val="22"/>
-          <w:szCs w:val="22"/>
-        </w:rPr>
-        <w:t xml:space="preserve">For blog writing specifically, Copy.ai's Brand Voice feature (Pro plan) maintains consistent tone across outputs, and its workflow automation can chain research → outline → draft in a single sequence.</w:t>
-      </w:r>
-    </w:p>
-    <w:p>
-      <w:pPr>
-        <w:spacing w:after="200"/>
-      </w:pPr>
-      <w:r>
-        <w:rPr>
-          <w:rFonts w:ascii="Calibri" w:cs="Calibri" w:eastAsia="Calibri" w:hAnsi="Calibri"/>
-          <w:b/>
-          <w:bCs/>
-          <w:i w:val="false"/>
-          <w:iCs w:val="false"/>
-          <w:color w:val="333333"/>
-          <w:sz w:val="22"/>
-          <w:szCs w:val="22"/>
-        </w:rPr>
-        <w:t xml:space="preserve">The catch: </w:t>
-      </w:r>
-      <w:r>
-        <w:rPr>
-          <w:rFonts w:ascii="Calibri" w:cs="Calibri" w:eastAsia="Calibri" w:hAnsi="Calibri"/>
-          <w:b w:val="false"/>
-          <w:bCs w:val="false"/>
-          <w:i w:val="false"/>
-          <w:iCs w:val="false"/>
-          <w:color w:val="333333"/>
-          <w:sz w:val="22"/>
-          <w:szCs w:val="22"/>
-        </w:rPr>
-        <w:t xml:space="preserve">Copy.ai is better at short-form than long-form. Blog posts above 1,500 words feel stitched together rather than cohesive. The free tier's 2,000-word limit covers roughly one short post. And at $49/month for Pro, you're in Jasper territory without the deeper brand intelligence features. I used Copy.ai for three months on social content and email — it was good there. For blog posts, Claude and ChatGPT produced better first drafts with less cleanup.</w:t>
-      </w:r>
-    </w:p>
-    <w:p>
-      <w:pPr>
-        <w:pStyle w:val="Heading2"/>
-        <w:spacing w:after="160" w:before="320"/>
-      </w:pPr>
-      <w:r>
-        <w:rPr>
-          <w:rFonts w:ascii="Calibri" w:cs="Calibri" w:eastAsia="Calibri" w:hAnsi="Calibri"/>
-          <w:b/>
-          <w:bCs/>
-          <w:color w:val="7C3AED"/>
-          <w:sz w:val="28"/>
-          <w:szCs w:val="28"/>
-        </w:rPr>
-        <w:t xml:space="preserve">How Do You Pick the Right AI Writing Tool for Your Blog?</w:t>
-      </w:r>
-    </w:p>
-    <w:p>
-      <w:pPr>
-        <w:spacing w:after="200"/>
-      </w:pPr>
-      <w:r>
-        <w:rPr>
-          <w:rFonts w:ascii="Calibri" w:cs="Calibri" w:eastAsia="Calibri" w:hAnsi="Calibri"/>
-          <w:b w:val="false"/>
-          <w:bCs w:val="false"/>
-          <w:i w:val="false"/>
-          <w:iCs w:val="false"/>
-          <w:color w:val="333333"/>
-          <w:sz w:val="22"/>
-          <w:szCs w:val="22"/>
-        </w:rPr>
-        <w:t xml:space="preserve">Match the tool to your bottleneck — the one step in your blogging workflow that takes the most time or produces the weakest results. Buying a tool that solves a problem you don't have is the most common mistake bloggers make.</w:t>
-      </w:r>
-    </w:p>
-    <w:p>
-      <w:pPr>
-        <w:spacing w:after="200"/>
-      </w:pPr>
-      <w:r>
-        <w:rPr>
-          <w:rFonts w:ascii="Calibri" w:cs="Calibri" w:eastAsia="Calibri" w:hAnsi="Calibri"/>
-          <w:b/>
-          <w:bCs/>
-          <w:i/>
-          <w:iCs/>
-          <w:color w:val="555555"/>
-          <w:sz w:val="22"/>
-          <w:szCs w:val="22"/>
-        </w:rPr>
-        <w:t xml:space="preserve">[IMAGE: how-to-choose-ai-blog-writing-tool-flowchart.webp]</w:t>
-      </w:r>
-    </w:p>
-    <w:p>
-      <w:pPr>
-        <w:spacing w:after="200"/>
-      </w:pPr>
-      <w:r>
-        <w:rPr>
-          <w:rFonts w:ascii="Calibri" w:cs="Calibri" w:eastAsia="Calibri" w:hAnsi="Calibri"/>
-          <w:b w:val="false"/>
-          <w:bCs w:val="false"/>
-          <w:i w:val="false"/>
-          <w:iCs w:val="false"/>
-          <w:color w:val="333333"/>
-          <w:sz w:val="22"/>
-          <w:szCs w:val="22"/>
-        </w:rPr>
-        <w:t xml:space="preserve">Pick your tier based on where you are right now:</w:t>
-      </w:r>
-    </w:p>
-    <w:p>
-      <w:pPr>
-        <w:pStyle w:val="Heading3"/>
-        <w:spacing w:after="160" w:before="320"/>
-      </w:pPr>
-      <w:r>
-        <w:rPr>
-          <w:rFonts w:ascii="Calibri" w:cs="Calibri" w:eastAsia="Calibri" w:hAnsi="Calibri"/>
-          <w:b/>
-          <w:bCs/>
-          <w:color w:val="7C3AED"/>
-          <w:sz w:val="24"/>
-          <w:szCs w:val="24"/>
-        </w:rPr>
         <w:t xml:space="preserve">If you're a beginner publishing 1-4 posts per month</w:t>
       </w:r>
     </w:p>
@@ -2600,9 +2578,9 @@
           <w:sz w:val="22"/>
           <w:szCs w:val="22"/>
         </w:rPr>
-        <w:t xml:space="preserve">Start free. Use ChatGPT for brainstorming and drafting, Perplexity for research, and Hemingway Editor for readability checks. Total cost: $0. This combination covers every step in the </w:t>
-      </w:r>
-      <w:hyperlink w:history="1" r:id="rId--vjt1rfkxtc7kzojx1ef">
+        <w:t xml:space="preserve">Start free. Use Claude for drafting (it follows complex instructions better than anything else), Perplexity and Grok for research, and Hemingway Editor for readability checks. Total cost: $0. This combination covers every step in the </w:t>
+      </w:r>
+      <w:hyperlink w:history="1" r:id="rIdnjjfxsumytzudww031o8w">
         <w:r>
           <w:rPr>
             <w:rStyle w:val="Hyperlink"/>
@@ -2631,24 +2609,6 @@
     </w:p>
     <w:p>
       <w:pPr>
-        <w:spacing w:after="200"/>
-      </w:pPr>
-      <w:r>
-        <w:rPr>
-          <w:rFonts w:ascii="Calibri" w:cs="Calibri" w:eastAsia="Calibri" w:hAnsi="Calibri"/>
-          <w:b w:val="false"/>
-          <w:bCs w:val="false"/>
-          <w:i w:val="false"/>
-          <w:iCs w:val="false"/>
-          <w:color w:val="333333"/>
-          <w:sz w:val="22"/>
-          <w:szCs w:val="22"/>
-        </w:rPr>
-        <w:t xml:space="preserve">Add Rytr ($9/mo, or $7.50/mo on annual billing) only if you want blog-specific templates and a simpler interface than ChatGPT.</w:t>
-      </w:r>
-    </w:p>
-    <w:p>
-      <w:pPr>
         <w:pStyle w:val="Heading3"/>
         <w:spacing w:after="160" w:before="320"/>
       </w:pPr>
@@ -2679,7 +2639,7 @@
           <w:sz w:val="22"/>
           <w:szCs w:val="22"/>
         </w:rPr>
-        <w:t xml:space="preserve">ChatGPT Plus or Claude Pro ($20/mo) for drafting, plus one SEO tool: Koala ($9/mo) for one-click SEO articles or NeuronWriter ($19/mo annual) for NLP content scoring. Budget: $29-39/month. This is exactly what I run for BrightlyFuture — and it covers everything.</w:t>
+        <w:t xml:space="preserve">Claude Pro ($20/mo) for drafting, plus one SEO tool: Koala ($9/mo) for one-click SEO articles or NeuronWriter ($19/mo annual) for NLP content scoring. Budget: $29-39/month. This is exactly what I run for BrightlyFuture — and the Search Console results I showed above prove it works.</w:t>
       </w:r>
     </w:p>
     <w:p>
@@ -2834,7 +2794,7 @@
           <w:sz w:val="22"/>
           <w:szCs w:val="22"/>
         </w:rPr>
-        <w:t xml:space="preserve">Perplexity AI (free) for cited research, or Frase ($49/mo) for SERP-driven content briefs. This stage answers: what should I write, and what's missing from competing articles?</w:t>
+        <w:t xml:space="preserve">Perplexity AI (free) for cited research, Grok for real-time data and latest statistics, or NeuronWriter ($19/mo annual) for SERP-driven content analysis. This stage answers: what should I write, and what's missing from competing articles?</w:t>
       </w:r>
     </w:p>
     <w:p>
@@ -2865,7 +2825,7 @@
           <w:sz w:val="22"/>
           <w:szCs w:val="22"/>
         </w:rPr>
-        <w:t xml:space="preserve">Claude or ChatGPT for writing one section at a time. Feed the research from Stage 1 into your prompts. A detailed prompt gets usable output. A lazy prompt gets content you'll throw away.</w:t>
+        <w:t xml:space="preserve">Claude for writing one section at a time. Feed the research from Stage 1 into your prompts with detailed instructions — target keywords, links to include, tone, structure. Claude follows multi-step briefs more accurately than any other tool, which means less rework in later stages.</w:t>
       </w:r>
     </w:p>
     <w:p>
@@ -2896,7 +2856,7 @@
           <w:sz w:val="22"/>
           <w:szCs w:val="22"/>
         </w:rPr>
-        <w:t xml:space="preserve">Koala, Surfer, or NeuronWriter to score the draft against SERP data. Plug in missing keywords, fix heading structure, and check entity coverage.</w:t>
+        <w:t xml:space="preserve">NeuronWriter or Surfer to score the draft against SERP data. Plug in missing keywords, fix heading structure, and check entity coverage. Koala can also generate SEO-optimized section drafts if specific parts need reworking.</w:t>
       </w:r>
     </w:p>
     <w:p>
@@ -2929,7 +2889,7 @@
         </w:rPr>
         <w:t xml:space="preserve">Edit manually using the </w:t>
       </w:r>
-      <w:hyperlink w:history="1" r:id="rId9zcl6f1ey8iuuqxmvkuz8">
+      <w:hyperlink w:history="1" r:id="rIdacqr-gp2is-iti6pp7jao">
         <w:r>
           <w:rPr>
             <w:rStyle w:val="Hyperlink"/>
@@ -3037,7 +2997,7 @@
           <w:sz w:val="22"/>
           <w:szCs w:val="22"/>
         </w:rPr>
-        <w:t xml:space="preserve">Koala AI, Frase, Surfer AI, Writesonic, NeuronWriter, and SEOWriting AI include some level of built-in SEO. ChatGPT, Claude, and Gemini have zero SEO features — they write well but don't know what's ranking.</w:t>
+        <w:t xml:space="preserve">Koala AI, Surfer AI, Writesonic, and NeuronWriter include some level of built-in SEO. ChatGPT, Claude, Gemini, Grok, and Perplexity have zero SEO features — they write and research well but don't know what's ranking.</w:t>
       </w:r>
     </w:p>
     <w:p>
@@ -3360,7 +3320,7 @@
                 <w:sz w:val="20"/>
                 <w:szCs w:val="20"/>
               </w:rPr>
-              <w:t xml:space="preserve">Frase</w:t>
+              <w:t xml:space="preserve">NeuronWriter</w:t>
             </w:r>
           </w:p>
         </w:tc>
@@ -3400,7 +3360,7 @@
                 <w:sz w:val="20"/>
                 <w:szCs w:val="20"/>
               </w:rPr>
-              <w:t xml:space="preserve">Top 20 SERP scrape</w:t>
+              <w:t xml:space="preserve">NLP-based</w:t>
             </w:r>
           </w:p>
         </w:tc>
@@ -3460,7 +3420,7 @@
                 <w:sz w:val="20"/>
                 <w:szCs w:val="20"/>
               </w:rPr>
-              <w:t xml:space="preserve">From $49/mo</w:t>
+              <w:t xml:space="preserve">From $23/mo ($19 annual)</w:t>
             </w:r>
           </w:p>
         </w:tc>
@@ -3709,250 +3669,6 @@
           </w:p>
         </w:tc>
       </w:tr>
-      <w:tr>
-        <w:tc>
-          <w:p>
-            <w:pPr>
-              <w:spacing w:after="40"/>
-            </w:pPr>
-            <w:r>
-              <w:rPr>
-                <w:rFonts w:ascii="Calibri" w:cs="Calibri" w:eastAsia="Calibri" w:hAnsi="Calibri"/>
-                <w:b w:val="false"/>
-                <w:bCs w:val="false"/>
-                <w:i w:val="false"/>
-                <w:iCs w:val="false"/>
-                <w:color w:val="333333"/>
-                <w:sz w:val="20"/>
-                <w:szCs w:val="20"/>
-              </w:rPr>
-              <w:t xml:space="preserve">NeuronWriter</w:t>
-            </w:r>
-          </w:p>
-        </w:tc>
-        <w:tc>
-          <w:p>
-            <w:pPr>
-              <w:spacing w:after="40"/>
-            </w:pPr>
-            <w:r>
-              <w:rPr>
-                <w:rFonts w:ascii="Calibri" w:cs="Calibri" w:eastAsia="Calibri" w:hAnsi="Calibri"/>
-                <w:b w:val="false"/>
-                <w:bCs w:val="false"/>
-                <w:i w:val="false"/>
-                <w:iCs w:val="false"/>
-                <w:color w:val="333333"/>
-                <w:sz w:val="20"/>
-                <w:szCs w:val="20"/>
-              </w:rPr>
-              <w:t xml:space="preserve">Yes</w:t>
-            </w:r>
-          </w:p>
-        </w:tc>
-        <w:tc>
-          <w:p>
-            <w:pPr>
-              <w:spacing w:after="40"/>
-            </w:pPr>
-            <w:r>
-              <w:rPr>
-                <w:rFonts w:ascii="Calibri" w:cs="Calibri" w:eastAsia="Calibri" w:hAnsi="Calibri"/>
-                <w:b w:val="false"/>
-                <w:bCs w:val="false"/>
-                <w:i w:val="false"/>
-                <w:iCs w:val="false"/>
-                <w:color w:val="333333"/>
-                <w:sz w:val="20"/>
-                <w:szCs w:val="20"/>
-              </w:rPr>
-              <w:t xml:space="preserve">NLP-based</w:t>
-            </w:r>
-          </w:p>
-        </w:tc>
-        <w:tc>
-          <w:p>
-            <w:pPr>
-              <w:spacing w:after="40"/>
-            </w:pPr>
-            <w:r>
-              <w:rPr>
-                <w:rFonts w:ascii="Calibri" w:cs="Calibri" w:eastAsia="Calibri" w:hAnsi="Calibri"/>
-                <w:b w:val="false"/>
-                <w:bCs w:val="false"/>
-                <w:i w:val="false"/>
-                <w:iCs w:val="false"/>
-                <w:color w:val="333333"/>
-                <w:sz w:val="20"/>
-                <w:szCs w:val="20"/>
-              </w:rPr>
-              <w:t xml:space="preserve">Yes</w:t>
-            </w:r>
-          </w:p>
-        </w:tc>
-        <w:tc>
-          <w:p>
-            <w:pPr>
-              <w:spacing w:after="40"/>
-            </w:pPr>
-            <w:r>
-              <w:rPr>
-                <w:rFonts w:ascii="Calibri" w:cs="Calibri" w:eastAsia="Calibri" w:hAnsi="Calibri"/>
-                <w:b w:val="false"/>
-                <w:bCs w:val="false"/>
-                <w:i w:val="false"/>
-                <w:iCs w:val="false"/>
-                <w:color w:val="333333"/>
-                <w:sz w:val="20"/>
-                <w:szCs w:val="20"/>
-              </w:rPr>
-              <w:t xml:space="preserve">No</w:t>
-            </w:r>
-          </w:p>
-        </w:tc>
-        <w:tc>
-          <w:p>
-            <w:pPr>
-              <w:spacing w:after="40"/>
-            </w:pPr>
-            <w:r>
-              <w:rPr>
-                <w:rFonts w:ascii="Calibri" w:cs="Calibri" w:eastAsia="Calibri" w:hAnsi="Calibri"/>
-                <w:b w:val="false"/>
-                <w:bCs w:val="false"/>
-                <w:i w:val="false"/>
-                <w:iCs w:val="false"/>
-                <w:color w:val="333333"/>
-                <w:sz w:val="20"/>
-                <w:szCs w:val="20"/>
-              </w:rPr>
-              <w:t xml:space="preserve">From $23/mo ($19 annual)</w:t>
-            </w:r>
-          </w:p>
-        </w:tc>
-      </w:tr>
-      <w:tr>
-        <w:tc>
-          <w:p>
-            <w:pPr>
-              <w:spacing w:after="40"/>
-            </w:pPr>
-            <w:r>
-              <w:rPr>
-                <w:rFonts w:ascii="Calibri" w:cs="Calibri" w:eastAsia="Calibri" w:hAnsi="Calibri"/>
-                <w:b w:val="false"/>
-                <w:bCs w:val="false"/>
-                <w:i w:val="false"/>
-                <w:iCs w:val="false"/>
-                <w:color w:val="333333"/>
-                <w:sz w:val="20"/>
-                <w:szCs w:val="20"/>
-              </w:rPr>
-              <w:t xml:space="preserve">SEOWriting AI</w:t>
-            </w:r>
-          </w:p>
-        </w:tc>
-        <w:tc>
-          <w:p>
-            <w:pPr>
-              <w:spacing w:after="40"/>
-            </w:pPr>
-            <w:r>
-              <w:rPr>
-                <w:rFonts w:ascii="Calibri" w:cs="Calibri" w:eastAsia="Calibri" w:hAnsi="Calibri"/>
-                <w:b w:val="false"/>
-                <w:bCs w:val="false"/>
-                <w:i w:val="false"/>
-                <w:iCs w:val="false"/>
-                <w:color w:val="333333"/>
-                <w:sz w:val="20"/>
-                <w:szCs w:val="20"/>
-              </w:rPr>
-              <w:t xml:space="preserve">Basic</w:t>
-            </w:r>
-          </w:p>
-        </w:tc>
-        <w:tc>
-          <w:p>
-            <w:pPr>
-              <w:spacing w:after="40"/>
-            </w:pPr>
-            <w:r>
-              <w:rPr>
-                <w:rFonts w:ascii="Calibri" w:cs="Calibri" w:eastAsia="Calibri" w:hAnsi="Calibri"/>
-                <w:b w:val="false"/>
-                <w:bCs w:val="false"/>
-                <w:i w:val="false"/>
-                <w:iCs w:val="false"/>
-                <w:color w:val="333333"/>
-                <w:sz w:val="20"/>
-                <w:szCs w:val="20"/>
-              </w:rPr>
-              <w:t xml:space="preserve">Basic</w:t>
-            </w:r>
-          </w:p>
-        </w:tc>
-        <w:tc>
-          <w:p>
-            <w:pPr>
-              <w:spacing w:after="40"/>
-            </w:pPr>
-            <w:r>
-              <w:rPr>
-                <w:rFonts w:ascii="Calibri" w:cs="Calibri" w:eastAsia="Calibri" w:hAnsi="Calibri"/>
-                <w:b w:val="false"/>
-                <w:bCs w:val="false"/>
-                <w:i w:val="false"/>
-                <w:iCs w:val="false"/>
-                <w:color w:val="333333"/>
-                <w:sz w:val="20"/>
-                <w:szCs w:val="20"/>
-              </w:rPr>
-              <w:t xml:space="preserve">Yes</w:t>
-            </w:r>
-          </w:p>
-        </w:tc>
-        <w:tc>
-          <w:p>
-            <w:pPr>
-              <w:spacing w:after="40"/>
-            </w:pPr>
-            <w:r>
-              <w:rPr>
-                <w:rFonts w:ascii="Calibri" w:cs="Calibri" w:eastAsia="Calibri" w:hAnsi="Calibri"/>
-                <w:b w:val="false"/>
-                <w:bCs w:val="false"/>
-                <w:i w:val="false"/>
-                <w:iCs w:val="false"/>
-                <w:color w:val="333333"/>
-                <w:sz w:val="20"/>
-                <w:szCs w:val="20"/>
-              </w:rPr>
-              <w:t xml:space="preserve">Auto FAQ schema</w:t>
-            </w:r>
-          </w:p>
-        </w:tc>
-        <w:tc>
-          <w:p>
-            <w:pPr>
-              <w:spacing w:after="40"/>
-            </w:pPr>
-            <w:r>
-              <w:rPr>
-                <w:rFonts w:ascii="Calibri" w:cs="Calibri" w:eastAsia="Calibri" w:hAnsi="Calibri"/>
-                <w:b w:val="false"/>
-                <w:bCs w:val="false"/>
-                <w:i w:val="false"/>
-                <w:iCs w:val="false"/>
-                <w:color w:val="333333"/>
-                <w:sz w:val="20"/>
-                <w:szCs w:val="20"/>
-              </w:rPr>
-              <w:t xml:space="preserve">From $14/mo</w:t>
-            </w:r>
-          </w:p>
-        </w:tc>
-      </w:tr>
     </w:tbl>
     <w:p>
       <w:pPr>
@@ -3969,7 +3685,7 @@
           <w:sz w:val="22"/>
           <w:szCs w:val="22"/>
         </w:rPr>
-        <w:t xml:space="preserve">If SEO matters to you — and if you're blogging to drive organic traffic, it should — pair a strong writer (ChatGPT or Claude) with a dedicated SEO tool (Frase or NeuronWriter). That combination beats any single tool trying to do both.</w:t>
+        <w:t xml:space="preserve">If SEO matters to you — and if you're blogging to drive organic traffic, it should — pair a strong writer (Claude) with a dedicated SEO tool (NeuronWriter for budget, Surfer for depth). That combination beats any single tool trying to do both.</w:t>
       </w:r>
     </w:p>
     <w:p>
@@ -4024,7 +3740,7 @@
         </w:rPr>
         <w:t xml:space="preserve">The data backs this up. </w:t>
       </w:r>
-      <w:hyperlink w:history="1" r:id="rIdrtutc51ymb8rxwotesiwt">
+      <w:hyperlink w:history="1" r:id="rIdkslu4whdqcqldmq7prhoh">
         <w:r>
           <w:rPr>
             <w:rStyle w:val="Hyperlink"/>
@@ -4334,7 +4050,7 @@
         </w:rPr>
         <w:t xml:space="preserve">The bloggers getting results in 2026 aren't choosing between AI and human writing. They're using AI to handle the 80% that's mechanical — structure, research synthesis, first drafts — and spending their time on the 20% that only a human can add: experience, voice, and accuracy. A </w:t>
       </w:r>
-      <w:hyperlink w:history="1" r:id="rIdeamuw0mmiv9hgvfnsfphv">
+      <w:hyperlink w:history="1" r:id="rIdamtaisdamepww5hguprdj">
         <w:r>
           <w:rPr>
             <w:rStyle w:val="Hyperlink"/>
@@ -4363,6 +4079,24 @@
     </w:p>
     <w:p>
       <w:pPr>
+        <w:spacing w:after="200"/>
+      </w:pPr>
+      <w:r>
+        <w:rPr>
+          <w:rFonts w:ascii="Calibri" w:cs="Calibri" w:eastAsia="Calibri" w:hAnsi="Calibri"/>
+          <w:b w:val="false"/>
+          <w:bCs w:val="false"/>
+          <w:i w:val="false"/>
+          <w:iCs w:val="false"/>
+          <w:color w:val="333333"/>
+          <w:sz w:val="22"/>
+          <w:szCs w:val="22"/>
+        </w:rPr>
+        <w:t xml:space="preserve">My own Search Console data tells the same story. Every article on BrightlyFuture was drafted with Claude and then manually edited — adding personal experience, verifying facts, rewriting sections that sounded robotic. The result: 970 clicks and 186K impressions in three months, with average position at 9. The AI drafted it. The human editing made it rank.</w:t>
+      </w:r>
+    </w:p>
+    <w:p>
+      <w:pPr>
         <w:pStyle w:val="Heading2"/>
         <w:spacing w:after="160" w:before="320"/>
       </w:pPr>
@@ -4442,38 +4176,38 @@
           <w:sz w:val="22"/>
           <w:szCs w:val="22"/>
         </w:rPr>
-        <w:t xml:space="preserve">Writesonic at $79/month does research, writing, and SEO. ChatGPT Plus ($20) + NeuronWriter ($19/mo annual) does all three better for under half the cost. All-in-one convenience rarely beats a focused stack — I learned this after wasting $237 on three months of Writesonic when a $39/month combo outperformed it.</w:t>
-      </w:r>
-    </w:p>
-    <w:p>
-      <w:pPr>
-        <w:spacing w:after="200"/>
-      </w:pPr>
-      <w:r>
-        <w:rPr>
-          <w:rFonts w:ascii="Calibri" w:cs="Calibri" w:eastAsia="Calibri" w:hAnsi="Calibri"/>
-          <w:b/>
-          <w:bCs/>
-          <w:i w:val="false"/>
-          <w:iCs w:val="false"/>
-          <w:color w:val="333333"/>
-          <w:sz w:val="22"/>
-          <w:szCs w:val="22"/>
-        </w:rPr>
-        <w:t xml:space="preserve">Confusing "free trial" with "free tool." </w:t>
-      </w:r>
-      <w:r>
-        <w:rPr>
-          <w:rFonts w:ascii="Calibri" w:cs="Calibri" w:eastAsia="Calibri" w:hAnsi="Calibri"/>
-          <w:b w:val="false"/>
-          <w:bCs w:val="false"/>
-          <w:i w:val="false"/>
-          <w:iCs w:val="false"/>
-          <w:color w:val="333333"/>
-          <w:sz w:val="22"/>
-          <w:szCs w:val="22"/>
-        </w:rPr>
-        <w:t xml:space="preserve">Jasper's 7-day trial, Copy.ai's limited free tier, and Writesonic's word-capped starter all expire or cripple. If you're budget-conscious, build your workflow on genuinely free tools first (ChatGPT, Claude, Gemini, Rytr). Add paid tools only when you've identified a specific bottleneck the free tools can't solve.</w:t>
+        <w:t xml:space="preserve">Writesonic at $79/month does research, writing, and SEO. Claude (free) + NeuronWriter ($19/mo annual) does all three better for a fraction of the cost. All-in-one convenience rarely beats a focused stack — I learned this after wasting $237 on three months of Writesonic when a $19/month combo outperformed it.</w:t>
+      </w:r>
+    </w:p>
+    <w:p>
+      <w:pPr>
+        <w:spacing w:after="200"/>
+      </w:pPr>
+      <w:r>
+        <w:rPr>
+          <w:rFonts w:ascii="Calibri" w:cs="Calibri" w:eastAsia="Calibri" w:hAnsi="Calibri"/>
+          <w:b/>
+          <w:bCs/>
+          <w:i w:val="false"/>
+          <w:iCs w:val="false"/>
+          <w:color w:val="333333"/>
+          <w:sz w:val="22"/>
+          <w:szCs w:val="22"/>
+        </w:rPr>
+        <w:t xml:space="preserve">Picking the most popular tool instead of the most accurate one. </w:t>
+      </w:r>
+      <w:r>
+        <w:rPr>
+          <w:rFonts w:ascii="Calibri" w:cs="Calibri" w:eastAsia="Calibri" w:hAnsi="Calibri"/>
+          <w:b w:val="false"/>
+          <w:bCs w:val="false"/>
+          <w:i w:val="false"/>
+          <w:iCs w:val="false"/>
+          <w:color w:val="333333"/>
+          <w:sz w:val="22"/>
+          <w:szCs w:val="22"/>
+        </w:rPr>
+        <w:t xml:space="preserve">ChatGPT has a billion users and dominates every "best of" list. But in my year of testing, it missed instructions on 9 out of 10 complex briefs — dropped internal links, skipped citations, ignored structure. Claude has a fraction of the user base and outperformed ChatGPT on every blog writing task I gave both tools. Popularity isn't accuracy.</w:t>
       </w:r>
     </w:p>
     <w:p>
@@ -4504,7 +4238,7 @@
           <w:sz w:val="22"/>
           <w:szCs w:val="22"/>
         </w:rPr>
-        <w:t xml:space="preserve">A tool that produces 10,000 words per hour sounds impressive until every article reads the same. Volume without humanization, fact-checking, and genuine expertise creates content that Google's helpful content system is designed to devalue.</w:t>
+        <w:t xml:space="preserve">A tool that produces 10,000 words per hour sounds impressive until every article reads the same. Volume without humanization, fact-checking, and real expertise creates content that Google's helpful content system is designed to devalue.</w:t>
       </w:r>
     </w:p>
     <w:p>
@@ -4535,7 +4269,7 @@
           <w:sz w:val="22"/>
           <w:szCs w:val="22"/>
         </w:rPr>
-        <w:t xml:space="preserve">No tool — free or paid, $7 or $79 — produces publish-ready content. Every draft needs your voice, your experience, and your editing before it goes live. If you're spending money on tools but zero time on editing, the tools aren't your problem.</w:t>
+        <w:t xml:space="preserve">No tool — free or paid, $0 or $79 — produces publish-ready content. Every draft needs your voice, your experience, and your editing before it goes live. If you're spending money on tools but zero time on editing, the tools aren't your problem.</w:t>
       </w:r>
     </w:p>
     <w:p>
@@ -4566,7 +4300,7 @@
           <w:sz w:val="22"/>
           <w:szCs w:val="22"/>
         </w:rPr>
-        <w:t xml:space="preserve">Surfer and Frase are powerful, but a content score doesn't replace understanding search intent, E-E-A-T, and what makes content rank. Learn the fundamentals first — the tools amplify knowledge, they don't replace it.</w:t>
+        <w:t xml:space="preserve">Surfer and NeuronWriter are powerful, but a content score doesn't replace understanding search intent, E-E-A-T, and what makes content rank. Learn the fundamentals first — the tools amplify knowledge, they don't replace it.</w:t>
       </w:r>
     </w:p>
     <w:p>
@@ -4642,20 +4376,20 @@
           <w:sz w:val="22"/>
           <w:szCs w:val="22"/>
         </w:rPr>
-        <w:t xml:space="preserve">Frase</w:t>
-      </w:r>
-      <w:r>
-        <w:rPr>
-          <w:rFonts w:ascii="Calibri" w:cs="Calibri" w:eastAsia="Calibri" w:hAnsi="Calibri"/>
-          <w:b w:val="false"/>
-          <w:bCs w:val="false"/>
-          <w:i w:val="false"/>
-          <w:iCs w:val="false"/>
-          <w:color w:val="333333"/>
-          <w:sz w:val="22"/>
-          <w:szCs w:val="22"/>
-        </w:rPr>
-        <w:t xml:space="preserve"> scrapes top 20 SERP results and identifies topic gaps in 30 seconds</w:t>
+        <w:t xml:space="preserve">NeuronWriter</w:t>
+      </w:r>
+      <w:r>
+        <w:rPr>
+          <w:rFonts w:ascii="Calibri" w:cs="Calibri" w:eastAsia="Calibri" w:hAnsi="Calibri"/>
+          <w:b w:val="false"/>
+          <w:bCs w:val="false"/>
+          <w:i w:val="false"/>
+          <w:iCs w:val="false"/>
+          <w:color w:val="333333"/>
+          <w:sz w:val="22"/>
+          <w:szCs w:val="22"/>
+        </w:rPr>
+        <w:t xml:space="preserve"> offers NLP scoring at $23/month ($19/mo annual) — the best value option for solo bloggers</w:t>
       </w:r>
     </w:p>
     <w:p>
@@ -4714,20 +4448,20 @@
           <w:sz w:val="22"/>
           <w:szCs w:val="22"/>
         </w:rPr>
-        <w:t xml:space="preserve">NeuronWriter</w:t>
-      </w:r>
-      <w:r>
-        <w:rPr>
-          <w:rFonts w:ascii="Calibri" w:cs="Calibri" w:eastAsia="Calibri" w:hAnsi="Calibri"/>
-          <w:b w:val="false"/>
-          <w:bCs w:val="false"/>
-          <w:i w:val="false"/>
-          <w:iCs w:val="false"/>
-          <w:color w:val="333333"/>
-          <w:sz w:val="22"/>
-          <w:szCs w:val="22"/>
-        </w:rPr>
-        <w:t xml:space="preserve"> offers similar NLP scoring at $23/month ($19/mo annual) — the best value option</w:t>
+        <w:t xml:space="preserve">Koala</w:t>
+      </w:r>
+      <w:r>
+        <w:rPr>
+          <w:rFonts w:ascii="Calibri" w:cs="Calibri" w:eastAsia="Calibri" w:hAnsi="Calibri"/>
+          <w:b w:val="false"/>
+          <w:bCs w:val="false"/>
+          <w:i w:val="false"/>
+          <w:iCs w:val="false"/>
+          <w:color w:val="333333"/>
+          <w:sz w:val="22"/>
+          <w:szCs w:val="22"/>
+        </w:rPr>
+        <w:t xml:space="preserve"> bakes basic SEO into every generated article automatically</w:t>
       </w:r>
     </w:p>
     <w:p>
@@ -4750,20 +4484,20 @@
           <w:sz w:val="22"/>
           <w:szCs w:val="22"/>
         </w:rPr>
-        <w:t xml:space="preserve">Koala</w:t>
-      </w:r>
-      <w:r>
-        <w:rPr>
-          <w:rFonts w:ascii="Calibri" w:cs="Calibri" w:eastAsia="Calibri" w:hAnsi="Calibri"/>
-          <w:b w:val="false"/>
-          <w:bCs w:val="false"/>
-          <w:i w:val="false"/>
-          <w:iCs w:val="false"/>
-          <w:color w:val="333333"/>
-          <w:sz w:val="22"/>
-          <w:szCs w:val="22"/>
-        </w:rPr>
-        <w:t xml:space="preserve"> bakes basic SEO into every generated article automatically</w:t>
+        <w:t xml:space="preserve">Writesonic</w:t>
+      </w:r>
+      <w:r>
+        <w:rPr>
+          <w:rFonts w:ascii="Calibri" w:cs="Calibri" w:eastAsia="Calibri" w:hAnsi="Calibri"/>
+          <w:b w:val="false"/>
+          <w:bCs w:val="false"/>
+          <w:i w:val="false"/>
+          <w:iCs w:val="false"/>
+          <w:color w:val="333333"/>
+          <w:sz w:val="22"/>
+          <w:szCs w:val="22"/>
+        </w:rPr>
+        <w:t xml:space="preserve"> integrates Ahrefs/SEMrush data directly, but at $79/mo the price is hard to justify</w:t>
       </w:r>
     </w:p>
     <w:p>
@@ -4817,9 +4551,9 @@
           <w:sz w:val="22"/>
           <w:szCs w:val="22"/>
         </w:rPr>
-        <w:t xml:space="preserve">The practical approach I use: traditional SEO tools for keyword and SERP optimization, then manually apply </w:t>
-      </w:r>
-      <w:hyperlink w:history="1" r:id="rIdhl8mole0hj9dy64pwuhh0">
+        <w:t xml:space="preserve">The practical approach I use: NeuronWriter for keyword and SERP optimization, then manually apply </w:t>
+      </w:r>
+      <w:hyperlink w:history="1" r:id="rIdjvs6wn9tgqfogqzlkopg8">
         <w:r>
           <w:rPr>
             <w:rStyle w:val="Hyperlink"/>
@@ -4895,7 +4629,7 @@
           <w:sz w:val="22"/>
           <w:szCs w:val="22"/>
         </w:rPr>
-        <w:t xml:space="preserve">ChatGPT and Claude support 50+ languages with solid output quality. Jasper supports 30+ with brand voice consistency. Most specialized SEO tools (Koala, Frase, Surfer) are built for English and offer limited multilingual support. If you blog in Urdu, Arabic, Hindi, or another non-Latin language, ChatGPT and Claude are your strongest options — dedicated platforms haven't caught up yet.</w:t>
+        <w:t xml:space="preserve">ChatGPT and Claude support 50+ languages with solid output quality. Jasper supports 30+ with brand voice consistency. Most specialized SEO tools (Koala, Surfer, NeuronWriter) are built for English and offer limited multilingual support. If you blog in Urdu, Arabic, Hindi, or another non-Latin language, ChatGPT and Claude are your strongest options — dedicated platforms haven't caught up yet.</w:t>
       </w:r>
     </w:p>
     <w:p>
@@ -4965,7 +4699,7 @@
           <w:sz w:val="22"/>
           <w:szCs w:val="22"/>
         </w:rPr>
-        <w:t xml:space="preserve">It depends on the tool and your plan. OpenAI uses free-tier ChatGPT conversations for model training unless you opt out in settings. Paid plans (ChatGPT Plus, Claude Pro) don't train on your inputs by default. Jasper and Copy.ai state they don't use customer content for training. Always read the data policy before pasting client work, proprietary research, or unpublished content into any AI tool — once it's in a training dataset, you can't pull it back.</w:t>
+        <w:t xml:space="preserve">It depends on the tool and your plan. OpenAI uses free-tier ChatGPT conversations for model training unless you opt out in settings. Paid plans (ChatGPT Plus, Claude Pro) don't train on your inputs by default. Jasper states it doesn't use customer content for training. Always read the data policy before pasting client work, proprietary research, or unpublished content into any AI tool — once it's in a training dataset, you can't pull it back.</w:t>
       </w:r>
     </w:p>
     <w:p>
@@ -5000,7 +4734,7 @@
           <w:sz w:val="22"/>
           <w:szCs w:val="22"/>
         </w:rPr>
-        <w:t xml:space="preserve">Yes — this is where tools like ChatGPT and Claude save the most time after the blog post is live. Paste your finished article and ask for 10 tweet threads, a LinkedIn carousel script, an email newsletter summary, or YouTube video script outline. Copy.ai and Jasper automate this with template chains. One 2,500-word blog post can feed a full week of social content across four platforms in under 30 minutes.</w:t>
+        <w:t xml:space="preserve">Yes — this is where tools like ChatGPT and Claude save the most time after the blog post is live. Paste your finished article and ask for 10 tweet threads, a LinkedIn carousel script, an email newsletter summary, or YouTube video script outline. Jasper automates this with template chains. One 2,500-word blog post can feed a full week of social content across four platforms in under 30 minutes.</w:t>
       </w:r>
     </w:p>
     <w:p>
@@ -5070,7 +4804,7 @@
           <w:sz w:val="22"/>
           <w:szCs w:val="22"/>
         </w:rPr>
-        <w:t xml:space="preserve">Several tools offer direct WordPress publishing: Koala AI, SEOWriting AI, and GetGenie AI all connect to WordPress and can publish drafts straight to your blog with one click. AIOSEO has a built-in AI assistant that works inside the Gutenberg editor without leaving WordPress at all. If your entire workflow lives in WordPress, these cut out the copy-paste step — but the drafts still need manual editing before going live.</w:t>
+        <w:t xml:space="preserve">Several tools offer direct WordPress publishing: Koala AI and GetGenie AI both connect to WordPress and can publish drafts straight to your blog with one click. AIOSEO has a built-in AI assistant that works inside the Gutenberg editor without leaving WordPress at all. If your entire workflow lives in WordPress, these cut out the copy-paste step — but the drafts still need manual editing before going live.</w:t>
       </w:r>
     </w:p>
     <w:p>
@@ -5105,25 +4839,25 @@
           <w:sz w:val="22"/>
           <w:szCs w:val="22"/>
         </w:rPr>
-        <w:t xml:space="preserve">Thirteen tools. Three tiers. The right choice depends on your budget, publishing volume, and where your workflow is weakest.</w:t>
-      </w:r>
-    </w:p>
-    <w:p>
-      <w:pPr>
-        <w:spacing w:after="200"/>
-      </w:pPr>
-      <w:r>
-        <w:rPr>
-          <w:rFonts w:ascii="Calibri" w:cs="Calibri" w:eastAsia="Calibri" w:hAnsi="Calibri"/>
-          <w:b w:val="false"/>
-          <w:bCs w:val="false"/>
-          <w:i w:val="false"/>
-          <w:iCs w:val="false"/>
-          <w:color w:val="333333"/>
-          <w:sz w:val="22"/>
-          <w:szCs w:val="22"/>
-        </w:rPr>
-        <w:t xml:space="preserve">If you're starting out: ChatGPT + Perplexity + Hemingway Editor. Free. Covers research, drafting, and editing. This is where I started, and it's still the core of my workflow.</w:t>
+        <w:t xml:space="preserve">Ten tools. Three tiers. The right choice depends on your budget, publishing volume, and where your workflow is weakest.</w:t>
+      </w:r>
+    </w:p>
+    <w:p>
+      <w:pPr>
+        <w:spacing w:after="200"/>
+      </w:pPr>
+      <w:r>
+        <w:rPr>
+          <w:rFonts w:ascii="Calibri" w:cs="Calibri" w:eastAsia="Calibri" w:hAnsi="Calibri"/>
+          <w:b w:val="false"/>
+          <w:bCs w:val="false"/>
+          <w:i w:val="false"/>
+          <w:iCs w:val="false"/>
+          <w:color w:val="333333"/>
+          <w:sz w:val="22"/>
+          <w:szCs w:val="22"/>
+        </w:rPr>
+        <w:t xml:space="preserve">If you're starting out: Claude + Perplexity + Grok + Hemingway Editor. Free. Covers research, drafting, and editing. Claude is where every article on this blog starts, and the Search Console results prove the approach works.</w:t>
       </w:r>
     </w:p>
     <w:p>
@@ -5197,7 +4931,7 @@
         </w:rPr>
         <w:t xml:space="preserve">Ready to put these tools to work? </w:t>
       </w:r>
-      <w:hyperlink w:history="1" r:id="rId1g-vvxq9bz73ck-0dqtvp">
+      <w:hyperlink w:history="1" r:id="rId7399tda_9mbpfndrfbmwz">
         <w:r>
           <w:rPr>
             <w:rStyle w:val="Hyperlink"/>

</xml_diff>